<commit_message>
Ajustar los documentos de entrega al formato de portada institucional
</commit_message>
<xml_diff>
--- a/docs/EnlaceRepositorio.docx
+++ b/docs/EnlaceRepositorio.docx
@@ -1,28 +1,33 @@
 
 <file path=word/document.xml><?xml version="1.0" encoding="utf-8"?>
-<w:document xmlns:w="http://schemas.openxmlformats.org/wordprocessingml/2006/main" xmlns:m="http://schemas.openxmlformats.org/officeDocument/2006/math" xmlns:r="http://schemas.openxmlformats.org/officeDocument/2006/relationships" xmlns:o="urn:schemas-microsoft-com:office:office" xmlns:v="urn:schemas-microsoft-com:vml" xmlns:w10="urn:schemas-microsoft-com:office:word" xmlns:a="http://schemas.openxmlformats.org/drawingml/2006/main" xmlns:pic="http://schemas.openxmlformats.org/drawingml/2006/picture" xmlns:wp="http://schemas.openxmlformats.org/drawingml/2006/wordprocessingDrawing">
+<w:document xmlns:wpc="http://schemas.microsoft.com/office/word/2010/wordprocessingCanvas" xmlns:cx="http://schemas.microsoft.com/office/drawing/2014/chartex" xmlns:cx1="http://schemas.microsoft.com/office/drawing/2015/9/8/chartex" xmlns:cx2="http://schemas.microsoft.com/office/drawing/2015/10/21/chartex" xmlns:cx3="http://schemas.microsoft.com/office/drawing/2016/5/9/chartex" xmlns:cx4="http://schemas.microsoft.com/office/drawing/2016/5/10/chartex" xmlns:cx5="http://schemas.microsoft.com/office/drawing/2016/5/11/chartex" xmlns:cx6="http://schemas.microsoft.com/office/drawing/2016/5/12/chartex" xmlns:cx7="http://schemas.microsoft.com/office/drawing/2016/5/13/chartex" xmlns:cx8="http://schemas.microsoft.com/office/drawing/2016/5/14/chartex" xmlns:mc="http://schemas.openxmlformats.org/markup-compatibility/2006" xmlns:aink="http://schemas.microsoft.com/office/drawing/2016/ink" xmlns:am3d="http://schemas.microsoft.com/office/drawing/2017/model3d" xmlns:o="urn:schemas-microsoft-com:office:office" xmlns:oel="http://schemas.microsoft.com/office/2019/extlst" xmlns:r="http://schemas.openxmlformats.org/officeDocument/2006/relationships" xmlns:m="http://schemas.openxmlformats.org/officeDocument/2006/math" xmlns:v="urn:schemas-microsoft-com:vml" xmlns:wp14="http://schemas.microsoft.com/office/word/2010/wordprocessingDrawing" xmlns:wp="http://schemas.openxmlformats.org/drawingml/2006/wordprocessingDrawing" xmlns:w10="urn:schemas-microsoft-com:office:word" xmlns:w="http://schemas.openxmlformats.org/wordprocessingml/2006/main" xmlns:w14="http://schemas.microsoft.com/office/word/2010/wordml" xmlns:w15="http://schemas.microsoft.com/office/word/2012/wordml" xmlns:w16cex="http://schemas.microsoft.com/office/word/2018/wordml/cex" xmlns:w16cid="http://schemas.microsoft.com/office/word/2016/wordml/cid" xmlns:w16="http://schemas.microsoft.com/office/word/2018/wordml" xmlns:w16du="http://schemas.microsoft.com/office/word/2023/wordml/word16du" xmlns:w16sdtdh="http://schemas.microsoft.com/office/word/2020/wordml/sdtdatahash" xmlns:w16sdtfl="http://schemas.microsoft.com/office/word/2024/wordml/sdtformatlock" xmlns:w16se="http://schemas.microsoft.com/office/word/2015/wordml/symex" xmlns:wpg="http://schemas.microsoft.com/office/word/2010/wordprocessingGroup" xmlns:wpi="http://schemas.microsoft.com/office/word/2010/wordprocessingInk" xmlns:wne="http://schemas.microsoft.com/office/word/2006/wordml" xmlns:wps="http://schemas.microsoft.com/office/word/2010/wordprocessingShape" mc:Ignorable="w14 w15 w16se w16cid w16 w16cex w16sdtdh w16sdtfl w16du wp14">
   <w:body>
     <w:p>
       <w:pPr>
-        <w:pStyle w:val="FirstParagraph"/>
+        <w:spacing w:after="440"/>
+        <w:jc w:val="center"/>
       </w:pPr>
       <w:r>
+        <w:rPr>
+          <w:noProof/>
+        </w:rPr>
         <w:drawing>
-          <wp:inline>
+          <wp:inline distT="0" distB="0" distL="0" distR="0">
             <wp:extent cx="4736592" cy="1788481"/>
-            <wp:effectExtent b="0" l="0" r="0" t="0"/>
-            <wp:docPr descr="" title="" id="19" name="Picture"/>
-            <a:graphic>
+            <wp:effectExtent l="0" t="0" r="0" b="0"/>
+            <wp:docPr id="19" name="Picture"/>
+            <wp:cNvGraphicFramePr/>
+            <a:graphic xmlns:a="http://schemas.openxmlformats.org/drawingml/2006/main">
               <a:graphicData uri="http://schemas.openxmlformats.org/drawingml/2006/picture">
-                <pic:pic>
+                <pic:pic xmlns:pic="http://schemas.openxmlformats.org/drawingml/2006/picture">
                   <pic:nvPicPr>
-                    <pic:cNvPr descr="diagramas/logo_itla.png" id="20" name="Picture"/>
+                    <pic:cNvPr id="20" name="Picture" descr="diagramas/logo_itla.png"/>
                     <pic:cNvPicPr>
-                      <a:picLocks noChangeArrowheads="1" noChangeAspect="1"/>
+                      <a:picLocks noChangeAspect="1" noChangeArrowheads="1"/>
                     </pic:cNvPicPr>
                   </pic:nvPicPr>
                   <pic:blipFill>
-                    <a:blip r:embed="rId18"/>
+                    <a:blip r:embed="rId5"/>
                     <a:stretch>
                       <a:fillRect/>
                     </a:stretch>
@@ -51,190 +56,173 @@
     </w:p>
     <w:p>
       <w:pPr>
-        <w:pStyle w:val="BodyText"/>
+        <w:spacing w:after="440"/>
+        <w:jc w:val="center"/>
       </w:pPr>
       <w:r>
         <w:rPr>
           <w:b/>
           <w:bCs/>
         </w:rPr>
-        <w:t xml:space="preserve">Presentación</w:t>
+        <w:t>Presentación</w:t>
       </w:r>
     </w:p>
     <w:p>
       <w:pPr>
-        <w:pStyle w:val="BodyText"/>
+        <w:spacing w:after="440"/>
+        <w:jc w:val="center"/>
       </w:pPr>
       <w:r>
         <w:rPr>
           <w:b/>
           <w:bCs/>
         </w:rPr>
-        <w:t xml:space="preserve">Nombres:</w:t>
+        <w:t>Nombres:</w:t>
+      </w:r>
+      <w:r>
+        <w:t xml:space="preserve"> Mario Alejandro</w:t>
+      </w:r>
+    </w:p>
+    <w:p>
+      <w:pPr>
+        <w:spacing w:after="440"/>
+        <w:jc w:val="center"/>
+      </w:pPr>
+      <w:r>
+        <w:rPr>
+          <w:b/>
+          <w:bCs/>
+        </w:rPr>
+        <w:t>Apellidos:</w:t>
+      </w:r>
+      <w:r>
+        <w:t xml:space="preserve"> Sabala Encarnación</w:t>
+      </w:r>
+    </w:p>
+    <w:p>
+      <w:pPr>
+        <w:spacing w:after="440"/>
+        <w:jc w:val="center"/>
+      </w:pPr>
+      <w:r>
+        <w:rPr>
+          <w:b/>
+          <w:bCs/>
+        </w:rPr>
+        <w:t>Matrícula:</w:t>
+      </w:r>
+      <w:r>
+        <w:t xml:space="preserve"> 2025-1035</w:t>
+      </w:r>
+    </w:p>
+    <w:p>
+      <w:pPr>
+        <w:spacing w:after="440"/>
+        <w:jc w:val="center"/>
+      </w:pPr>
+      <w:r>
+        <w:rPr>
+          <w:b/>
+          <w:bCs/>
+        </w:rPr>
+        <w:t>Carrera:</w:t>
+      </w:r>
+      <w:r>
+        <w:t xml:space="preserve"> Desarrollo de Software</w:t>
+      </w:r>
+    </w:p>
+    <w:p>
+      <w:pPr>
+        <w:spacing w:after="440"/>
+        <w:jc w:val="center"/>
+      </w:pPr>
+      <w:r>
+        <w:rPr>
+          <w:b/>
+          <w:bCs/>
+        </w:rPr>
+        <w:t>Materia:</w:t>
+      </w:r>
+      <w:r>
+        <w:t xml:space="preserve"> Big Data</w:t>
+      </w:r>
+    </w:p>
+    <w:p>
+      <w:pPr>
+        <w:spacing w:after="440"/>
+        <w:jc w:val="center"/>
+      </w:pPr>
+      <w:r>
+        <w:rPr>
+          <w:b/>
+          <w:bCs/>
+        </w:rPr>
+        <w:t>Tema:</w:t>
       </w:r>
       <w:r>
         <w:t xml:space="preserve"> </w:t>
       </w:r>
       <w:r>
-        <w:t xml:space="preserve">Mario Alejandro</w:t>
+        <w:t>Creación de la Arquitectura y Desarrollo del Proceso de Extracción (E de ETL)</w:t>
       </w:r>
     </w:p>
     <w:p>
       <w:pPr>
-        <w:pStyle w:val="BodyText"/>
+        <w:spacing w:after="440"/>
+        <w:jc w:val="center"/>
       </w:pPr>
       <w:r>
         <w:rPr>
           <w:b/>
           <w:bCs/>
         </w:rPr>
-        <w:t xml:space="preserve">Apellidos:</w:t>
+        <w:t>Docente:</w:t>
       </w:r>
       <w:r>
-        <w:t xml:space="preserve"> </w:t>
-      </w:r>
-      <w:r>
-        <w:t xml:space="preserve">Sabala Encarnación</w:t>
+        <w:t xml:space="preserve"> Francis Ramírez</w:t>
       </w:r>
     </w:p>
     <w:p>
       <w:pPr>
-        <w:pStyle w:val="BodyText"/>
+        <w:spacing w:after="440"/>
+        <w:jc w:val="center"/>
       </w:pPr>
       <w:r>
         <w:rPr>
           <w:b/>
           <w:bCs/>
         </w:rPr>
-        <w:t xml:space="preserve">Matrícula:</w:t>
+        <w:t>Fecha de entrega:</w:t>
       </w:r>
       <w:r>
-        <w:t xml:space="preserve"> </w:t>
-      </w:r>
-      <w:r>
-        <w:t xml:space="preserve">2025-1035</w:t>
+        <w:t xml:space="preserve"> 05/08/2026</w:t>
       </w:r>
     </w:p>
     <w:p>
       <w:pPr>
-        <w:pStyle w:val="BodyText"/>
+        <w:spacing w:after="440"/>
+        <w:jc w:val="center"/>
       </w:pPr>
       <w:r>
         <w:rPr>
           <w:b/>
           <w:bCs/>
         </w:rPr>
-        <w:t xml:space="preserve">Carrera:</w:t>
-      </w:r>
-      <w:r>
-        <w:t xml:space="preserve"> </w:t>
-      </w:r>
-      <w:r>
-        <w:t xml:space="preserve">Desarrollo de Software</w:t>
+        <w:t>Enlace al repositorio de GitHub con el código fuente del Worker Service (.NET 8):</w:t>
       </w:r>
     </w:p>
     <w:p>
       <w:pPr>
-        <w:pStyle w:val="BodyText"/>
+        <w:spacing w:after="440"/>
+        <w:jc w:val="center"/>
       </w:pPr>
       <w:r>
-        <w:rPr>
-          <w:b/>
-          <w:bCs/>
-        </w:rPr>
-        <w:t xml:space="preserve">Materia:</w:t>
-      </w:r>
-      <w:r>
-        <w:t xml:space="preserve"> </w:t>
-      </w:r>
-      <w:r>
-        <w:t xml:space="preserve">Big Data</w:t>
-      </w:r>
-    </w:p>
-    <w:p>
-      <w:pPr>
-        <w:pStyle w:val="BodyText"/>
-      </w:pPr>
-      <w:r>
-        <w:rPr>
-          <w:b/>
-          <w:bCs/>
-        </w:rPr>
-        <w:t xml:space="preserve">Tema:</w:t>
-      </w:r>
-      <w:r>
-        <w:t xml:space="preserve"> </w:t>
-      </w:r>
-      <w:r>
-        <w:t xml:space="preserve">Creación de la Arquitectura y Desarrollo del Proceso de Extracción (E de ETL)</w:t>
-      </w:r>
-    </w:p>
-    <w:p>
-      <w:pPr>
-        <w:pStyle w:val="BodyText"/>
-      </w:pPr>
-      <w:r>
-        <w:rPr>
-          <w:b/>
-          <w:bCs/>
-        </w:rPr>
-        <w:t xml:space="preserve">Docente:</w:t>
-      </w:r>
-      <w:r>
-        <w:t xml:space="preserve"> </w:t>
-      </w:r>
-      <w:r>
-        <w:t xml:space="preserve">Francis Ramírez</w:t>
-      </w:r>
-    </w:p>
-    <w:p>
-      <w:pPr>
-        <w:pStyle w:val="BodyText"/>
-      </w:pPr>
-      <w:r>
-        <w:rPr>
-          <w:b/>
-          <w:bCs/>
-        </w:rPr>
-        <w:t xml:space="preserve">Fecha de entrega:</w:t>
-      </w:r>
-      <w:r>
-        <w:t xml:space="preserve"> </w:t>
-      </w:r>
-      <w:r>
-        <w:t xml:space="preserve">05/08/2026</w:t>
-      </w:r>
-    </w:p>
-    <w:p>
-      <w:r>
-        <w:pict>
-          <v:rect style="width:0;height:1.5pt" o:hralign="center" o:hrstd="t" o:hr="t"/>
-        </w:pict>
-      </w:r>
-    </w:p>
-    <w:p>
-      <w:pPr>
-        <w:pStyle w:val="FirstParagraph"/>
-      </w:pPr>
-      <w:r>
-        <w:rPr>
-          <w:b/>
-          <w:bCs/>
-        </w:rPr>
-        <w:t xml:space="preserve">Enlace al repositorio de GitHub con el código fuente del Worker Service (.NET 8):</w:t>
-      </w:r>
-    </w:p>
-    <w:p>
-      <w:pPr>
-        <w:pStyle w:val="BodyText"/>
-      </w:pPr>
-      <w:r>
-        <w:t xml:space="preserve">https://github.com/MarioMahir/-SistemaAnalisisOpiniones</w:t>
+        <w:t>https://github.com/MarioMahir/-SistemaAnalisisOpiniones</w:t>
       </w:r>
     </w:p>
     <w:sectPr>
-      <w:pgSz w:h="15840" w:w="12240"/>
-      <w:pgMar w:bottom="1440" w:footer="708" w:gutter="0" w:header="708" w:left="1440" w:right="1440" w:top="1440"/>
+      <w:pgSz w:w="12240" w:h="15840"/>
+      <w:pgMar w:top="1440" w:right="1440" w:bottom="1440" w:left="1440" w:header="708" w:footer="708" w:gutter="0"/>
       <w:cols w:space="708"/>
       <w:docGrid w:linePitch="360"/>
     </w:sectPr>
@@ -242,32 +230,86 @@
 </w:document>
 </file>
 
-<file path=word/comments.xml><?xml version="1.0" encoding="utf-8"?>
-<w:comments xmlns:w="http://schemas.openxmlformats.org/wordprocessingml/2006/main" xmlns:m="http://schemas.openxmlformats.org/officeDocument/2006/math" xmlns:r="http://schemas.openxmlformats.org/officeDocument/2006/relationships" xmlns:o="urn:schemas-microsoft-com:office:office" xmlns:v="urn:schemas-microsoft-com:vml" xmlns:w10="urn:schemas-microsoft-com:office:word" xmlns:a="http://schemas.openxmlformats.org/drawingml/2006/main" xmlns:pic="http://schemas.openxmlformats.org/drawingml/2006/picture" xmlns:wp="http://schemas.openxmlformats.org/drawingml/2006/wordprocessingDrawing"/>
-</file>
-
-<file path=word/footnotes.xml><?xml version="1.0" encoding="utf-8"?>
-<w:footnotes xmlns:w="http://schemas.openxmlformats.org/wordprocessingml/2006/main" xmlns:m="http://schemas.openxmlformats.org/officeDocument/2006/math" xmlns:r="http://schemas.openxmlformats.org/officeDocument/2006/relationships" xmlns:o="urn:schemas-microsoft-com:office:office" xmlns:v="urn:schemas-microsoft-com:vml" xmlns:w10="urn:schemas-microsoft-com:office:word" xmlns:a="http://schemas.openxmlformats.org/drawingml/2006/main" xmlns:pic="http://schemas.openxmlformats.org/drawingml/2006/picture" xmlns:wp="http://schemas.openxmlformats.org/drawingml/2006/wordprocessingDrawing">
-  <w:footnote w:type="continuationSeparator" w:id="0">
-    <w:p>
-      <w:r>
-        <w:continuationSeparator/>
-      </w:r>
-    </w:p>
-  </w:footnote>
-  <w:footnote w:type="separator" w:id="-1">
-    <w:p>
-      <w:r>
-        <w:separator/>
-      </w:r>
-    </w:p>
-  </w:footnote>
-</w:footnotes>
-</file>
-
 <file path=word/numbering.xml><?xml version="1.0" encoding="utf-8"?>
-<w:numbering xmlns:aink="http://schemas.microsoft.com/office/drawing/2016/ink" xmlns:am3d="http://schemas.microsoft.com/office/drawing/2017/model3d" xmlns:cx="http://schemas.microsoft.com/office/drawing/2014/chartex" xmlns:cx1="http://schemas.microsoft.com/office/drawing/2015/9/8/chartex" xmlns:cx2="http://schemas.microsoft.com/office/drawing/2015/10/21/chartex" xmlns:cx3="http://schemas.microsoft.com/office/drawing/2016/5/9/chartex" xmlns:cx4="http://schemas.microsoft.com/office/drawing/2016/5/10/chartex" xmlns:cx5="http://schemas.microsoft.com/office/drawing/2016/5/11/chartex" xmlns:cx6="http://schemas.microsoft.com/office/drawing/2016/5/12/chartex" xmlns:cx7="http://schemas.microsoft.com/office/drawing/2016/5/13/chartex" xmlns:cx8="http://schemas.microsoft.com/office/drawing/2016/5/14/chartex" xmlns:m="http://schemas.openxmlformats.org/officeDocument/2006/math" xmlns:mc="http://schemas.openxmlformats.org/markup-compatibility/2006" xmlns:o="urn:schemas-microsoft-com:office:office" xmlns:oel="http://schemas.microsoft.com/office/2019/extlst" xmlns:r="http://schemas.openxmlformats.org/officeDocument/2006/relationships" xmlns:v="urn:schemas-microsoft-com:vml" xmlns:w="http://schemas.openxmlformats.org/wordprocessingml/2006/main" xmlns:w10="urn:schemas-microsoft-com:office:word" xmlns:w14="http://schemas.microsoft.com/office/word/2010/wordml" xmlns:w15="http://schemas.microsoft.com/office/word/2012/wordml" xmlns:w16="http://schemas.microsoft.com/office/word/2018/wordml" xmlns:w16cex="http://schemas.microsoft.com/office/word/2018/wordml/cex" xmlns:w16cid="http://schemas.microsoft.com/office/word/2016/wordml/cid" xmlns:w16du="http://schemas.microsoft.com/office/word/2023/wordml/word16du" xmlns:w16sdtdh="http://schemas.microsoft.com/office/word/2020/wordml/sdtdatahash" xmlns:w16sdtfl="http://schemas.microsoft.com/office/word/2024/wordml/sdtformatlock" xmlns:w16se="http://schemas.microsoft.com/office/word/2015/wordml/symex" xmlns:wne="http://schemas.microsoft.com/office/word/2006/wordml" xmlns:wp="http://schemas.openxmlformats.org/drawingml/2006/wordprocessingDrawing" xmlns:wp14="http://schemas.microsoft.com/office/word/2010/wordprocessingDrawing" xmlns:wpc="http://schemas.microsoft.com/office/word/2010/wordprocessingCanvas" xmlns:wpg="http://schemas.microsoft.com/office/word/2010/wordprocessingGroup" xmlns:wpi="http://schemas.microsoft.com/office/word/2010/wordprocessingInk" xmlns:wps="http://schemas.microsoft.com/office/word/2010/wordprocessingShape" mc:Ignorable="w14 w15 w16se w16cid w16 w16cex w16sdtdh w16sdtfl w16du wp14">
-  <w:abstractNum w15:restartNumberingAfterBreak="0" w:abstractNumId="0">
+<w:numbering xmlns:wpc="http://schemas.microsoft.com/office/word/2010/wordprocessingCanvas" xmlns:cx="http://schemas.microsoft.com/office/drawing/2014/chartex" xmlns:cx1="http://schemas.microsoft.com/office/drawing/2015/9/8/chartex" xmlns:cx2="http://schemas.microsoft.com/office/drawing/2015/10/21/chartex" xmlns:cx3="http://schemas.microsoft.com/office/drawing/2016/5/9/chartex" xmlns:cx4="http://schemas.microsoft.com/office/drawing/2016/5/10/chartex" xmlns:cx5="http://schemas.microsoft.com/office/drawing/2016/5/11/chartex" xmlns:cx6="http://schemas.microsoft.com/office/drawing/2016/5/12/chartex" xmlns:cx7="http://schemas.microsoft.com/office/drawing/2016/5/13/chartex" xmlns:cx8="http://schemas.microsoft.com/office/drawing/2016/5/14/chartex" xmlns:mc="http://schemas.openxmlformats.org/markup-compatibility/2006" xmlns:aink="http://schemas.microsoft.com/office/drawing/2016/ink" xmlns:am3d="http://schemas.microsoft.com/office/drawing/2017/model3d" xmlns:o="urn:schemas-microsoft-com:office:office" xmlns:oel="http://schemas.microsoft.com/office/2019/extlst" xmlns:r="http://schemas.openxmlformats.org/officeDocument/2006/relationships" xmlns:m="http://schemas.openxmlformats.org/officeDocument/2006/math" xmlns:v="urn:schemas-microsoft-com:vml" xmlns:wp14="http://schemas.microsoft.com/office/word/2010/wordprocessingDrawing" xmlns:wp="http://schemas.openxmlformats.org/drawingml/2006/wordprocessingDrawing" xmlns:w10="urn:schemas-microsoft-com:office:word" xmlns:w="http://schemas.openxmlformats.org/wordprocessingml/2006/main" xmlns:w14="http://schemas.microsoft.com/office/word/2010/wordml" xmlns:w15="http://schemas.microsoft.com/office/word/2012/wordml" xmlns:w16cex="http://schemas.microsoft.com/office/word/2018/wordml/cex" xmlns:w16cid="http://schemas.microsoft.com/office/word/2016/wordml/cid" xmlns:w16="http://schemas.microsoft.com/office/word/2018/wordml" xmlns:w16du="http://schemas.microsoft.com/office/word/2023/wordml/word16du" xmlns:w16sdtdh="http://schemas.microsoft.com/office/word/2020/wordml/sdtdatahash" xmlns:w16sdtfl="http://schemas.microsoft.com/office/word/2024/wordml/sdtformatlock" xmlns:w16se="http://schemas.microsoft.com/office/word/2015/wordml/symex" xmlns:wpg="http://schemas.microsoft.com/office/word/2010/wordprocessingGroup" xmlns:wpi="http://schemas.microsoft.com/office/word/2010/wordprocessingInk" xmlns:wne="http://schemas.microsoft.com/office/word/2006/wordml" xmlns:wps="http://schemas.microsoft.com/office/word/2010/wordprocessingShape" mc:Ignorable="w14 w15 w16se w16cid w16 w16cex w16sdtdh w16sdtfl w16du wp14">
+  <w:abstractNum w:abstractNumId="0" w15:restartNumberingAfterBreak="0">
+    <w:nsid w:val="0000A990"/>
+    <w:multiLevelType w:val="multilevel"/>
+    <w:tmpl w:val="1242DA32"/>
+    <w:lvl w:ilvl="0">
+      <w:numFmt w:val="bullet"/>
+      <w:lvlText w:val=" "/>
+      <w:lvlJc w:val="left"/>
+      <w:pPr>
+        <w:ind w:left="720" w:hanging="360"/>
+      </w:pPr>
+    </w:lvl>
+    <w:lvl w:ilvl="1">
+      <w:numFmt w:val="bullet"/>
+      <w:lvlText w:val=" "/>
+      <w:lvlJc w:val="left"/>
+      <w:pPr>
+        <w:ind w:left="1440" w:hanging="360"/>
+      </w:pPr>
+    </w:lvl>
+    <w:lvl w:ilvl="2">
+      <w:numFmt w:val="bullet"/>
+      <w:lvlText w:val=" "/>
+      <w:lvlJc w:val="left"/>
+      <w:pPr>
+        <w:ind w:left="2160" w:hanging="360"/>
+      </w:pPr>
+    </w:lvl>
+    <w:lvl w:ilvl="3">
+      <w:numFmt w:val="bullet"/>
+      <w:lvlText w:val=" "/>
+      <w:lvlJc w:val="left"/>
+      <w:pPr>
+        <w:ind w:left="2880" w:hanging="360"/>
+      </w:pPr>
+    </w:lvl>
+    <w:lvl w:ilvl="4">
+      <w:numFmt w:val="bullet"/>
+      <w:lvlText w:val=" "/>
+      <w:lvlJc w:val="left"/>
+      <w:pPr>
+        <w:ind w:left="3600" w:hanging="360"/>
+      </w:pPr>
+    </w:lvl>
+    <w:lvl w:ilvl="5">
+      <w:numFmt w:val="bullet"/>
+      <w:lvlText w:val=" "/>
+      <w:lvlJc w:val="left"/>
+      <w:pPr>
+        <w:ind w:left="4320" w:hanging="360"/>
+      </w:pPr>
+    </w:lvl>
+    <w:lvl w:ilvl="6">
+      <w:numFmt w:val="bullet"/>
+      <w:lvlText w:val=" "/>
+      <w:lvlJc w:val="left"/>
+      <w:pPr>
+        <w:ind w:left="5040" w:hanging="360"/>
+      </w:pPr>
+    </w:lvl>
+    <w:lvl w:ilvl="7">
+      <w:numFmt w:val="bullet"/>
+      <w:lvlText w:val=" "/>
+      <w:lvlJc w:val="left"/>
+      <w:pPr>
+        <w:ind w:left="5760" w:hanging="360"/>
+      </w:pPr>
+    </w:lvl>
+    <w:lvl w:ilvl="8">
+      <w:numFmt w:val="bullet"/>
+      <w:lvlText w:val=" "/>
+      <w:lvlJc w:val="left"/>
+      <w:pPr>
+        <w:ind w:left="6480" w:hanging="360"/>
+      </w:pPr>
+    </w:lvl>
+  </w:abstractNum>
+  <w:abstractNum w:abstractNumId="1" w15:restartNumberingAfterBreak="0">
     <w:nsid w:val="23361190"/>
     <w:multiLevelType w:val="hybridMultilevel"/>
     <w:tmpl w:val="AD94B02E"/>
@@ -276,110 +318,110 @@
       <w:lvlText w:val="-"/>
       <w:lvlJc w:val="left"/>
       <w:pPr>
-        <w:ind w:hanging="360" w:left="1080"/>
-      </w:pPr>
-      <w:rPr>
-        <w:rFonts w:ascii="Times New Roman" w:cs="Times New Roman" w:eastAsiaTheme="minorHAnsi" w:hAnsi="Times New Roman" w:hint="default"/>
-      </w:rPr>
-    </w:lvl>
-    <w:lvl w:ilvl="1" w:tentative="1" w:tplc="04090003">
+        <w:ind w:left="1080" w:hanging="360"/>
+      </w:pPr>
+      <w:rPr>
+        <w:rFonts w:ascii="Times New Roman" w:eastAsiaTheme="minorHAnsi" w:hAnsi="Times New Roman" w:cs="Times New Roman" w:hint="default"/>
+      </w:rPr>
+    </w:lvl>
+    <w:lvl w:ilvl="1" w:tplc="04090003" w:tentative="1">
       <w:start w:val="1"/>
       <w:numFmt w:val="bullet"/>
       <w:lvlText w:val="o"/>
       <w:lvlJc w:val="left"/>
       <w:pPr>
-        <w:ind w:hanging="360" w:left="1800"/>
-      </w:pPr>
-      <w:rPr>
-        <w:rFonts w:ascii="Courier New" w:cs="Courier New" w:hAnsi="Courier New" w:hint="default"/>
-      </w:rPr>
-    </w:lvl>
-    <w:lvl w:ilvl="2" w:tentative="1" w:tplc="04090005">
+        <w:ind w:left="1800" w:hanging="360"/>
+      </w:pPr>
+      <w:rPr>
+        <w:rFonts w:ascii="Courier New" w:hAnsi="Courier New" w:cs="Courier New" w:hint="default"/>
+      </w:rPr>
+    </w:lvl>
+    <w:lvl w:ilvl="2" w:tplc="04090005" w:tentative="1">
       <w:start w:val="1"/>
       <w:numFmt w:val="bullet"/>
       <w:lvlText w:val=""/>
       <w:lvlJc w:val="left"/>
       <w:pPr>
-        <w:ind w:hanging="360" w:left="2520"/>
+        <w:ind w:left="2520" w:hanging="360"/>
       </w:pPr>
       <w:rPr>
         <w:rFonts w:ascii="Wingdings" w:hAnsi="Wingdings" w:hint="default"/>
       </w:rPr>
     </w:lvl>
-    <w:lvl w:ilvl="3" w:tentative="1" w:tplc="04090001">
+    <w:lvl w:ilvl="3" w:tplc="04090001" w:tentative="1">
       <w:start w:val="1"/>
       <w:numFmt w:val="bullet"/>
       <w:lvlText w:val=""/>
       <w:lvlJc w:val="left"/>
       <w:pPr>
-        <w:ind w:hanging="360" w:left="3240"/>
+        <w:ind w:left="3240" w:hanging="360"/>
       </w:pPr>
       <w:rPr>
         <w:rFonts w:ascii="Symbol" w:hAnsi="Symbol" w:hint="default"/>
       </w:rPr>
     </w:lvl>
-    <w:lvl w:ilvl="4" w:tentative="1" w:tplc="04090003">
+    <w:lvl w:ilvl="4" w:tplc="04090003" w:tentative="1">
       <w:start w:val="1"/>
       <w:numFmt w:val="bullet"/>
       <w:lvlText w:val="o"/>
       <w:lvlJc w:val="left"/>
       <w:pPr>
-        <w:ind w:hanging="360" w:left="3960"/>
-      </w:pPr>
-      <w:rPr>
-        <w:rFonts w:ascii="Courier New" w:cs="Courier New" w:hAnsi="Courier New" w:hint="default"/>
-      </w:rPr>
-    </w:lvl>
-    <w:lvl w:ilvl="5" w:tentative="1" w:tplc="04090005">
+        <w:ind w:left="3960" w:hanging="360"/>
+      </w:pPr>
+      <w:rPr>
+        <w:rFonts w:ascii="Courier New" w:hAnsi="Courier New" w:cs="Courier New" w:hint="default"/>
+      </w:rPr>
+    </w:lvl>
+    <w:lvl w:ilvl="5" w:tplc="04090005" w:tentative="1">
       <w:start w:val="1"/>
       <w:numFmt w:val="bullet"/>
       <w:lvlText w:val=""/>
       <w:lvlJc w:val="left"/>
       <w:pPr>
-        <w:ind w:hanging="360" w:left="4680"/>
+        <w:ind w:left="4680" w:hanging="360"/>
       </w:pPr>
       <w:rPr>
         <w:rFonts w:ascii="Wingdings" w:hAnsi="Wingdings" w:hint="default"/>
       </w:rPr>
     </w:lvl>
-    <w:lvl w:ilvl="6" w:tentative="1" w:tplc="04090001">
+    <w:lvl w:ilvl="6" w:tplc="04090001" w:tentative="1">
       <w:start w:val="1"/>
       <w:numFmt w:val="bullet"/>
       <w:lvlText w:val=""/>
       <w:lvlJc w:val="left"/>
       <w:pPr>
-        <w:ind w:hanging="360" w:left="5400"/>
+        <w:ind w:left="5400" w:hanging="360"/>
       </w:pPr>
       <w:rPr>
         <w:rFonts w:ascii="Symbol" w:hAnsi="Symbol" w:hint="default"/>
       </w:rPr>
     </w:lvl>
-    <w:lvl w:ilvl="7" w:tentative="1" w:tplc="04090003">
+    <w:lvl w:ilvl="7" w:tplc="04090003" w:tentative="1">
       <w:start w:val="1"/>
       <w:numFmt w:val="bullet"/>
       <w:lvlText w:val="o"/>
       <w:lvlJc w:val="left"/>
       <w:pPr>
-        <w:ind w:hanging="360" w:left="6120"/>
-      </w:pPr>
-      <w:rPr>
-        <w:rFonts w:ascii="Courier New" w:cs="Courier New" w:hAnsi="Courier New" w:hint="default"/>
-      </w:rPr>
-    </w:lvl>
-    <w:lvl w:ilvl="8" w:tentative="1" w:tplc="04090005">
+        <w:ind w:left="6120" w:hanging="360"/>
+      </w:pPr>
+      <w:rPr>
+        <w:rFonts w:ascii="Courier New" w:hAnsi="Courier New" w:cs="Courier New" w:hint="default"/>
+      </w:rPr>
+    </w:lvl>
+    <w:lvl w:ilvl="8" w:tplc="04090005" w:tentative="1">
       <w:start w:val="1"/>
       <w:numFmt w:val="bullet"/>
       <w:lvlText w:val=""/>
       <w:lvlJc w:val="left"/>
       <w:pPr>
-        <w:ind w:hanging="360" w:left="6840"/>
+        <w:ind w:left="6840" w:hanging="360"/>
       </w:pPr>
       <w:rPr>
         <w:rFonts w:ascii="Wingdings" w:hAnsi="Wingdings" w:hint="default"/>
       </w:rPr>
     </w:lvl>
   </w:abstractNum>
-  <w:abstractNum w15:restartNumberingAfterBreak="0" w:abstractNumId="1">
+  <w:abstractNum w:abstractNumId="2" w15:restartNumberingAfterBreak="0">
     <w:nsid w:val="30D81242"/>
     <w:multiLevelType w:val="hybridMultilevel"/>
     <w:tmpl w:val="1E145016"/>
@@ -389,110 +431,110 @@
       <w:lvlText w:val=""/>
       <w:lvlJc w:val="left"/>
       <w:pPr>
-        <w:ind w:hanging="360" w:left="720"/>
+        <w:ind w:left="720" w:hanging="360"/>
       </w:pPr>
       <w:rPr>
         <w:rFonts w:ascii="Symbol" w:hAnsi="Symbol" w:hint="default"/>
       </w:rPr>
     </w:lvl>
-    <w:lvl w:ilvl="1" w:tentative="1" w:tplc="04090003">
+    <w:lvl w:ilvl="1" w:tplc="04090003" w:tentative="1">
       <w:start w:val="1"/>
       <w:numFmt w:val="bullet"/>
       <w:lvlText w:val="o"/>
       <w:lvlJc w:val="left"/>
       <w:pPr>
-        <w:ind w:hanging="360" w:left="1440"/>
-      </w:pPr>
-      <w:rPr>
-        <w:rFonts w:ascii="Courier New" w:cs="Courier New" w:hAnsi="Courier New" w:hint="default"/>
-      </w:rPr>
-    </w:lvl>
-    <w:lvl w:ilvl="2" w:tentative="1" w:tplc="04090005">
+        <w:ind w:left="1440" w:hanging="360"/>
+      </w:pPr>
+      <w:rPr>
+        <w:rFonts w:ascii="Courier New" w:hAnsi="Courier New" w:cs="Courier New" w:hint="default"/>
+      </w:rPr>
+    </w:lvl>
+    <w:lvl w:ilvl="2" w:tplc="04090005" w:tentative="1">
       <w:start w:val="1"/>
       <w:numFmt w:val="bullet"/>
       <w:lvlText w:val=""/>
       <w:lvlJc w:val="left"/>
       <w:pPr>
-        <w:ind w:hanging="360" w:left="2160"/>
+        <w:ind w:left="2160" w:hanging="360"/>
       </w:pPr>
       <w:rPr>
         <w:rFonts w:ascii="Wingdings" w:hAnsi="Wingdings" w:hint="default"/>
       </w:rPr>
     </w:lvl>
-    <w:lvl w:ilvl="3" w:tentative="1" w:tplc="04090001">
+    <w:lvl w:ilvl="3" w:tplc="04090001" w:tentative="1">
       <w:start w:val="1"/>
       <w:numFmt w:val="bullet"/>
       <w:lvlText w:val=""/>
       <w:lvlJc w:val="left"/>
       <w:pPr>
-        <w:ind w:hanging="360" w:left="2880"/>
+        <w:ind w:left="2880" w:hanging="360"/>
       </w:pPr>
       <w:rPr>
         <w:rFonts w:ascii="Symbol" w:hAnsi="Symbol" w:hint="default"/>
       </w:rPr>
     </w:lvl>
-    <w:lvl w:ilvl="4" w:tentative="1" w:tplc="04090003">
+    <w:lvl w:ilvl="4" w:tplc="04090003" w:tentative="1">
       <w:start w:val="1"/>
       <w:numFmt w:val="bullet"/>
       <w:lvlText w:val="o"/>
       <w:lvlJc w:val="left"/>
       <w:pPr>
-        <w:ind w:hanging="360" w:left="3600"/>
-      </w:pPr>
-      <w:rPr>
-        <w:rFonts w:ascii="Courier New" w:cs="Courier New" w:hAnsi="Courier New" w:hint="default"/>
-      </w:rPr>
-    </w:lvl>
-    <w:lvl w:ilvl="5" w:tentative="1" w:tplc="04090005">
+        <w:ind w:left="3600" w:hanging="360"/>
+      </w:pPr>
+      <w:rPr>
+        <w:rFonts w:ascii="Courier New" w:hAnsi="Courier New" w:cs="Courier New" w:hint="default"/>
+      </w:rPr>
+    </w:lvl>
+    <w:lvl w:ilvl="5" w:tplc="04090005" w:tentative="1">
       <w:start w:val="1"/>
       <w:numFmt w:val="bullet"/>
       <w:lvlText w:val=""/>
       <w:lvlJc w:val="left"/>
       <w:pPr>
-        <w:ind w:hanging="360" w:left="4320"/>
+        <w:ind w:left="4320" w:hanging="360"/>
       </w:pPr>
       <w:rPr>
         <w:rFonts w:ascii="Wingdings" w:hAnsi="Wingdings" w:hint="default"/>
       </w:rPr>
     </w:lvl>
-    <w:lvl w:ilvl="6" w:tentative="1" w:tplc="04090001">
+    <w:lvl w:ilvl="6" w:tplc="04090001" w:tentative="1">
       <w:start w:val="1"/>
       <w:numFmt w:val="bullet"/>
       <w:lvlText w:val=""/>
       <w:lvlJc w:val="left"/>
       <w:pPr>
-        <w:ind w:hanging="360" w:left="5040"/>
+        <w:ind w:left="5040" w:hanging="360"/>
       </w:pPr>
       <w:rPr>
         <w:rFonts w:ascii="Symbol" w:hAnsi="Symbol" w:hint="default"/>
       </w:rPr>
     </w:lvl>
-    <w:lvl w:ilvl="7" w:tentative="1" w:tplc="04090003">
+    <w:lvl w:ilvl="7" w:tplc="04090003" w:tentative="1">
       <w:start w:val="1"/>
       <w:numFmt w:val="bullet"/>
       <w:lvlText w:val="o"/>
       <w:lvlJc w:val="left"/>
       <w:pPr>
-        <w:ind w:hanging="360" w:left="5760"/>
-      </w:pPr>
-      <w:rPr>
-        <w:rFonts w:ascii="Courier New" w:cs="Courier New" w:hAnsi="Courier New" w:hint="default"/>
-      </w:rPr>
-    </w:lvl>
-    <w:lvl w:ilvl="8" w:tentative="1" w:tplc="04090005">
+        <w:ind w:left="5760" w:hanging="360"/>
+      </w:pPr>
+      <w:rPr>
+        <w:rFonts w:ascii="Courier New" w:hAnsi="Courier New" w:cs="Courier New" w:hint="default"/>
+      </w:rPr>
+    </w:lvl>
+    <w:lvl w:ilvl="8" w:tplc="04090005" w:tentative="1">
       <w:start w:val="1"/>
       <w:numFmt w:val="bullet"/>
       <w:lvlText w:val=""/>
       <w:lvlJc w:val="left"/>
       <w:pPr>
-        <w:ind w:hanging="360" w:left="6480"/>
+        <w:ind w:left="6480" w:hanging="360"/>
       </w:pPr>
       <w:rPr>
         <w:rFonts w:ascii="Wingdings" w:hAnsi="Wingdings" w:hint="default"/>
       </w:rPr>
     </w:lvl>
   </w:abstractNum>
-  <w:abstractNum w15:restartNumberingAfterBreak="0" w:abstractNumId="2">
+  <w:abstractNum w:abstractNumId="3" w15:restartNumberingAfterBreak="0">
     <w:nsid w:val="3D97020D"/>
     <w:multiLevelType w:val="hybridMultilevel"/>
     <w:tmpl w:val="A2FAC258"/>
@@ -502,110 +544,110 @@
       <w:lvlText w:val=""/>
       <w:lvlJc w:val="left"/>
       <w:pPr>
-        <w:ind w:hanging="360" w:left="720"/>
+        <w:ind w:left="720" w:hanging="360"/>
       </w:pPr>
       <w:rPr>
         <w:rFonts w:ascii="Symbol" w:hAnsi="Symbol" w:hint="default"/>
       </w:rPr>
     </w:lvl>
-    <w:lvl w:ilvl="1" w:tentative="1" w:tplc="04090003">
+    <w:lvl w:ilvl="1" w:tplc="04090003" w:tentative="1">
       <w:start w:val="1"/>
       <w:numFmt w:val="bullet"/>
       <w:lvlText w:val="o"/>
       <w:lvlJc w:val="left"/>
       <w:pPr>
-        <w:ind w:hanging="360" w:left="1440"/>
-      </w:pPr>
-      <w:rPr>
-        <w:rFonts w:ascii="Courier New" w:cs="Courier New" w:hAnsi="Courier New" w:hint="default"/>
-      </w:rPr>
-    </w:lvl>
-    <w:lvl w:ilvl="2" w:tentative="1" w:tplc="04090005">
+        <w:ind w:left="1440" w:hanging="360"/>
+      </w:pPr>
+      <w:rPr>
+        <w:rFonts w:ascii="Courier New" w:hAnsi="Courier New" w:cs="Courier New" w:hint="default"/>
+      </w:rPr>
+    </w:lvl>
+    <w:lvl w:ilvl="2" w:tplc="04090005" w:tentative="1">
       <w:start w:val="1"/>
       <w:numFmt w:val="bullet"/>
       <w:lvlText w:val=""/>
       <w:lvlJc w:val="left"/>
       <w:pPr>
-        <w:ind w:hanging="360" w:left="2160"/>
+        <w:ind w:left="2160" w:hanging="360"/>
       </w:pPr>
       <w:rPr>
         <w:rFonts w:ascii="Wingdings" w:hAnsi="Wingdings" w:hint="default"/>
       </w:rPr>
     </w:lvl>
-    <w:lvl w:ilvl="3" w:tentative="1" w:tplc="04090001">
+    <w:lvl w:ilvl="3" w:tplc="04090001" w:tentative="1">
       <w:start w:val="1"/>
       <w:numFmt w:val="bullet"/>
       <w:lvlText w:val=""/>
       <w:lvlJc w:val="left"/>
       <w:pPr>
-        <w:ind w:hanging="360" w:left="2880"/>
+        <w:ind w:left="2880" w:hanging="360"/>
       </w:pPr>
       <w:rPr>
         <w:rFonts w:ascii="Symbol" w:hAnsi="Symbol" w:hint="default"/>
       </w:rPr>
     </w:lvl>
-    <w:lvl w:ilvl="4" w:tentative="1" w:tplc="04090003">
+    <w:lvl w:ilvl="4" w:tplc="04090003" w:tentative="1">
       <w:start w:val="1"/>
       <w:numFmt w:val="bullet"/>
       <w:lvlText w:val="o"/>
       <w:lvlJc w:val="left"/>
       <w:pPr>
-        <w:ind w:hanging="360" w:left="3600"/>
-      </w:pPr>
-      <w:rPr>
-        <w:rFonts w:ascii="Courier New" w:cs="Courier New" w:hAnsi="Courier New" w:hint="default"/>
-      </w:rPr>
-    </w:lvl>
-    <w:lvl w:ilvl="5" w:tentative="1" w:tplc="04090005">
+        <w:ind w:left="3600" w:hanging="360"/>
+      </w:pPr>
+      <w:rPr>
+        <w:rFonts w:ascii="Courier New" w:hAnsi="Courier New" w:cs="Courier New" w:hint="default"/>
+      </w:rPr>
+    </w:lvl>
+    <w:lvl w:ilvl="5" w:tplc="04090005" w:tentative="1">
       <w:start w:val="1"/>
       <w:numFmt w:val="bullet"/>
       <w:lvlText w:val=""/>
       <w:lvlJc w:val="left"/>
       <w:pPr>
-        <w:ind w:hanging="360" w:left="4320"/>
+        <w:ind w:left="4320" w:hanging="360"/>
       </w:pPr>
       <w:rPr>
         <w:rFonts w:ascii="Wingdings" w:hAnsi="Wingdings" w:hint="default"/>
       </w:rPr>
     </w:lvl>
-    <w:lvl w:ilvl="6" w:tentative="1" w:tplc="04090001">
+    <w:lvl w:ilvl="6" w:tplc="04090001" w:tentative="1">
       <w:start w:val="1"/>
       <w:numFmt w:val="bullet"/>
       <w:lvlText w:val=""/>
       <w:lvlJc w:val="left"/>
       <w:pPr>
-        <w:ind w:hanging="360" w:left="5040"/>
+        <w:ind w:left="5040" w:hanging="360"/>
       </w:pPr>
       <w:rPr>
         <w:rFonts w:ascii="Symbol" w:hAnsi="Symbol" w:hint="default"/>
       </w:rPr>
     </w:lvl>
-    <w:lvl w:ilvl="7" w:tentative="1" w:tplc="04090003">
+    <w:lvl w:ilvl="7" w:tplc="04090003" w:tentative="1">
       <w:start w:val="1"/>
       <w:numFmt w:val="bullet"/>
       <w:lvlText w:val="o"/>
       <w:lvlJc w:val="left"/>
       <w:pPr>
-        <w:ind w:hanging="360" w:left="5760"/>
-      </w:pPr>
-      <w:rPr>
-        <w:rFonts w:ascii="Courier New" w:cs="Courier New" w:hAnsi="Courier New" w:hint="default"/>
-      </w:rPr>
-    </w:lvl>
-    <w:lvl w:ilvl="8" w:tentative="1" w:tplc="04090005">
+        <w:ind w:left="5760" w:hanging="360"/>
+      </w:pPr>
+      <w:rPr>
+        <w:rFonts w:ascii="Courier New" w:hAnsi="Courier New" w:cs="Courier New" w:hint="default"/>
+      </w:rPr>
+    </w:lvl>
+    <w:lvl w:ilvl="8" w:tplc="04090005" w:tentative="1">
       <w:start w:val="1"/>
       <w:numFmt w:val="bullet"/>
       <w:lvlText w:val=""/>
       <w:lvlJc w:val="left"/>
       <w:pPr>
-        <w:ind w:hanging="360" w:left="6480"/>
+        <w:ind w:left="6480" w:hanging="360"/>
       </w:pPr>
       <w:rPr>
         <w:rFonts w:ascii="Wingdings" w:hAnsi="Wingdings" w:hint="default"/>
       </w:rPr>
     </w:lvl>
   </w:abstractNum>
-  <w:abstractNum w15:restartNumberingAfterBreak="0" w:abstractNumId="3">
+  <w:abstractNum w:abstractNumId="4" w15:restartNumberingAfterBreak="0">
     <w:nsid w:val="4D1D1C53"/>
     <w:multiLevelType w:val="hybridMultilevel"/>
     <w:tmpl w:val="EE64F4EC"/>
@@ -615,86 +657,86 @@
       <w:lvlText w:val="%1."/>
       <w:lvlJc w:val="left"/>
       <w:pPr>
-        <w:ind w:hanging="360" w:left="360"/>
+        <w:ind w:left="360" w:hanging="360"/>
       </w:pPr>
       <w:rPr>
         <w:rFonts w:hint="default"/>
       </w:rPr>
     </w:lvl>
-    <w:lvl w:ilvl="1" w:tentative="1" w:tplc="04090019">
+    <w:lvl w:ilvl="1" w:tplc="04090019" w:tentative="1">
       <w:start w:val="1"/>
       <w:numFmt w:val="lowerLetter"/>
       <w:lvlText w:val="%2."/>
       <w:lvlJc w:val="left"/>
       <w:pPr>
-        <w:ind w:hanging="360" w:left="1080"/>
-      </w:pPr>
-    </w:lvl>
-    <w:lvl w:ilvl="2" w:tentative="1" w:tplc="0409001B">
+        <w:ind w:left="1080" w:hanging="360"/>
+      </w:pPr>
+    </w:lvl>
+    <w:lvl w:ilvl="2" w:tplc="0409001B" w:tentative="1">
       <w:start w:val="1"/>
       <w:numFmt w:val="lowerRoman"/>
       <w:lvlText w:val="%3."/>
       <w:lvlJc w:val="right"/>
       <w:pPr>
-        <w:ind w:hanging="180" w:left="1800"/>
-      </w:pPr>
-    </w:lvl>
-    <w:lvl w:ilvl="3" w:tentative="1" w:tplc="0409000F">
+        <w:ind w:left="1800" w:hanging="180"/>
+      </w:pPr>
+    </w:lvl>
+    <w:lvl w:ilvl="3" w:tplc="0409000F" w:tentative="1">
       <w:start w:val="1"/>
       <w:numFmt w:val="decimal"/>
       <w:lvlText w:val="%4."/>
       <w:lvlJc w:val="left"/>
       <w:pPr>
-        <w:ind w:hanging="360" w:left="2520"/>
-      </w:pPr>
-    </w:lvl>
-    <w:lvl w:ilvl="4" w:tentative="1" w:tplc="04090019">
+        <w:ind w:left="2520" w:hanging="360"/>
+      </w:pPr>
+    </w:lvl>
+    <w:lvl w:ilvl="4" w:tplc="04090019" w:tentative="1">
       <w:start w:val="1"/>
       <w:numFmt w:val="lowerLetter"/>
       <w:lvlText w:val="%5."/>
       <w:lvlJc w:val="left"/>
       <w:pPr>
-        <w:ind w:hanging="360" w:left="3240"/>
-      </w:pPr>
-    </w:lvl>
-    <w:lvl w:ilvl="5" w:tentative="1" w:tplc="0409001B">
+        <w:ind w:left="3240" w:hanging="360"/>
+      </w:pPr>
+    </w:lvl>
+    <w:lvl w:ilvl="5" w:tplc="0409001B" w:tentative="1">
       <w:start w:val="1"/>
       <w:numFmt w:val="lowerRoman"/>
       <w:lvlText w:val="%6."/>
       <w:lvlJc w:val="right"/>
       <w:pPr>
-        <w:ind w:hanging="180" w:left="3960"/>
-      </w:pPr>
-    </w:lvl>
-    <w:lvl w:ilvl="6" w:tentative="1" w:tplc="0409000F">
+        <w:ind w:left="3960" w:hanging="180"/>
+      </w:pPr>
+    </w:lvl>
+    <w:lvl w:ilvl="6" w:tplc="0409000F" w:tentative="1">
       <w:start w:val="1"/>
       <w:numFmt w:val="decimal"/>
       <w:lvlText w:val="%7."/>
       <w:lvlJc w:val="left"/>
       <w:pPr>
-        <w:ind w:hanging="360" w:left="4680"/>
-      </w:pPr>
-    </w:lvl>
-    <w:lvl w:ilvl="7" w:tentative="1" w:tplc="04090019">
+        <w:ind w:left="4680" w:hanging="360"/>
+      </w:pPr>
+    </w:lvl>
+    <w:lvl w:ilvl="7" w:tplc="04090019" w:tentative="1">
       <w:start w:val="1"/>
       <w:numFmt w:val="lowerLetter"/>
       <w:lvlText w:val="%8."/>
       <w:lvlJc w:val="left"/>
       <w:pPr>
-        <w:ind w:hanging="360" w:left="5400"/>
-      </w:pPr>
-    </w:lvl>
-    <w:lvl w:ilvl="8" w:tentative="1" w:tplc="0409001B">
+        <w:ind w:left="5400" w:hanging="360"/>
+      </w:pPr>
+    </w:lvl>
+    <w:lvl w:ilvl="8" w:tplc="0409001B" w:tentative="1">
       <w:start w:val="1"/>
       <w:numFmt w:val="lowerRoman"/>
       <w:lvlText w:val="%9."/>
       <w:lvlJc w:val="right"/>
       <w:pPr>
-        <w:ind w:hanging="180" w:left="6120"/>
+        <w:ind w:left="6120" w:hanging="180"/>
       </w:pPr>
     </w:lvl>
   </w:abstractNum>
-  <w:abstractNum w15:restartNumberingAfterBreak="0" w:abstractNumId="4">
+  <w:abstractNum w:abstractNumId="5" w15:restartNumberingAfterBreak="0">
     <w:nsid w:val="55A02367"/>
     <w:multiLevelType w:val="hybridMultilevel"/>
     <w:tmpl w:val="BAB06DD8"/>
@@ -704,110 +746,110 @@
       <w:lvlText w:val=""/>
       <w:lvlJc w:val="left"/>
       <w:pPr>
-        <w:ind w:hanging="360" w:left="720"/>
+        <w:ind w:left="720" w:hanging="360"/>
       </w:pPr>
       <w:rPr>
         <w:rFonts w:ascii="Symbol" w:hAnsi="Symbol" w:hint="default"/>
       </w:rPr>
     </w:lvl>
-    <w:lvl w:ilvl="1" w:tentative="1" w:tplc="04090003">
+    <w:lvl w:ilvl="1" w:tplc="04090003" w:tentative="1">
       <w:start w:val="1"/>
       <w:numFmt w:val="bullet"/>
       <w:lvlText w:val="o"/>
       <w:lvlJc w:val="left"/>
       <w:pPr>
-        <w:ind w:hanging="360" w:left="1440"/>
-      </w:pPr>
-      <w:rPr>
-        <w:rFonts w:ascii="Courier New" w:cs="Courier New" w:hAnsi="Courier New" w:hint="default"/>
-      </w:rPr>
-    </w:lvl>
-    <w:lvl w:ilvl="2" w:tentative="1" w:tplc="04090005">
+        <w:ind w:left="1440" w:hanging="360"/>
+      </w:pPr>
+      <w:rPr>
+        <w:rFonts w:ascii="Courier New" w:hAnsi="Courier New" w:cs="Courier New" w:hint="default"/>
+      </w:rPr>
+    </w:lvl>
+    <w:lvl w:ilvl="2" w:tplc="04090005" w:tentative="1">
       <w:start w:val="1"/>
       <w:numFmt w:val="bullet"/>
       <w:lvlText w:val=""/>
       <w:lvlJc w:val="left"/>
       <w:pPr>
-        <w:ind w:hanging="360" w:left="2160"/>
+        <w:ind w:left="2160" w:hanging="360"/>
       </w:pPr>
       <w:rPr>
         <w:rFonts w:ascii="Wingdings" w:hAnsi="Wingdings" w:hint="default"/>
       </w:rPr>
     </w:lvl>
-    <w:lvl w:ilvl="3" w:tentative="1" w:tplc="04090001">
+    <w:lvl w:ilvl="3" w:tplc="04090001" w:tentative="1">
       <w:start w:val="1"/>
       <w:numFmt w:val="bullet"/>
       <w:lvlText w:val=""/>
       <w:lvlJc w:val="left"/>
       <w:pPr>
-        <w:ind w:hanging="360" w:left="2880"/>
+        <w:ind w:left="2880" w:hanging="360"/>
       </w:pPr>
       <w:rPr>
         <w:rFonts w:ascii="Symbol" w:hAnsi="Symbol" w:hint="default"/>
       </w:rPr>
     </w:lvl>
-    <w:lvl w:ilvl="4" w:tentative="1" w:tplc="04090003">
+    <w:lvl w:ilvl="4" w:tplc="04090003" w:tentative="1">
       <w:start w:val="1"/>
       <w:numFmt w:val="bullet"/>
       <w:lvlText w:val="o"/>
       <w:lvlJc w:val="left"/>
       <w:pPr>
-        <w:ind w:hanging="360" w:left="3600"/>
-      </w:pPr>
-      <w:rPr>
-        <w:rFonts w:ascii="Courier New" w:cs="Courier New" w:hAnsi="Courier New" w:hint="default"/>
-      </w:rPr>
-    </w:lvl>
-    <w:lvl w:ilvl="5" w:tentative="1" w:tplc="04090005">
+        <w:ind w:left="3600" w:hanging="360"/>
+      </w:pPr>
+      <w:rPr>
+        <w:rFonts w:ascii="Courier New" w:hAnsi="Courier New" w:cs="Courier New" w:hint="default"/>
+      </w:rPr>
+    </w:lvl>
+    <w:lvl w:ilvl="5" w:tplc="04090005" w:tentative="1">
       <w:start w:val="1"/>
       <w:numFmt w:val="bullet"/>
       <w:lvlText w:val=""/>
       <w:lvlJc w:val="left"/>
       <w:pPr>
-        <w:ind w:hanging="360" w:left="4320"/>
+        <w:ind w:left="4320" w:hanging="360"/>
       </w:pPr>
       <w:rPr>
         <w:rFonts w:ascii="Wingdings" w:hAnsi="Wingdings" w:hint="default"/>
       </w:rPr>
     </w:lvl>
-    <w:lvl w:ilvl="6" w:tentative="1" w:tplc="04090001">
+    <w:lvl w:ilvl="6" w:tplc="04090001" w:tentative="1">
       <w:start w:val="1"/>
       <w:numFmt w:val="bullet"/>
       <w:lvlText w:val=""/>
       <w:lvlJc w:val="left"/>
       <w:pPr>
-        <w:ind w:hanging="360" w:left="5040"/>
+        <w:ind w:left="5040" w:hanging="360"/>
       </w:pPr>
       <w:rPr>
         <w:rFonts w:ascii="Symbol" w:hAnsi="Symbol" w:hint="default"/>
       </w:rPr>
     </w:lvl>
-    <w:lvl w:ilvl="7" w:tentative="1" w:tplc="04090003">
+    <w:lvl w:ilvl="7" w:tplc="04090003" w:tentative="1">
       <w:start w:val="1"/>
       <w:numFmt w:val="bullet"/>
       <w:lvlText w:val="o"/>
       <w:lvlJc w:val="left"/>
       <w:pPr>
-        <w:ind w:hanging="360" w:left="5760"/>
-      </w:pPr>
-      <w:rPr>
-        <w:rFonts w:ascii="Courier New" w:cs="Courier New" w:hAnsi="Courier New" w:hint="default"/>
-      </w:rPr>
-    </w:lvl>
-    <w:lvl w:ilvl="8" w:tentative="1" w:tplc="04090005">
+        <w:ind w:left="5760" w:hanging="360"/>
+      </w:pPr>
+      <w:rPr>
+        <w:rFonts w:ascii="Courier New" w:hAnsi="Courier New" w:cs="Courier New" w:hint="default"/>
+      </w:rPr>
+    </w:lvl>
+    <w:lvl w:ilvl="8" w:tplc="04090005" w:tentative="1">
       <w:start w:val="1"/>
       <w:numFmt w:val="bullet"/>
       <w:lvlText w:val=""/>
       <w:lvlJc w:val="left"/>
       <w:pPr>
-        <w:ind w:hanging="360" w:left="6480"/>
+        <w:ind w:left="6480" w:hanging="360"/>
       </w:pPr>
       <w:rPr>
         <w:rFonts w:ascii="Wingdings" w:hAnsi="Wingdings" w:hint="default"/>
       </w:rPr>
     </w:lvl>
   </w:abstractNum>
-  <w:abstractNum w15:restartNumberingAfterBreak="0" w:abstractNumId="5">
+  <w:abstractNum w:abstractNumId="6" w15:restartNumberingAfterBreak="0">
     <w:nsid w:val="75C2608D"/>
     <w:multiLevelType w:val="multilevel"/>
     <w:tmpl w:val="6C04433C"/>
@@ -817,7 +859,7 @@
       <w:lvlText w:val="%1."/>
       <w:lvlJc w:val="left"/>
       <w:pPr>
-        <w:ind w:hanging="360" w:left="720"/>
+        <w:ind w:left="720" w:hanging="360"/>
       </w:pPr>
       <w:rPr>
         <w:rFonts w:hint="default"/>
@@ -832,7 +874,7 @@
       <w:lvlText w:val="%1.%2."/>
       <w:lvlJc w:val="left"/>
       <w:pPr>
-        <w:ind w:hanging="360" w:left="1080"/>
+        <w:ind w:left="1080" w:hanging="360"/>
       </w:pPr>
       <w:rPr>
         <w:rFonts w:hint="default"/>
@@ -847,7 +889,7 @@
       <w:lvlText w:val="%1.%2.%3."/>
       <w:lvlJc w:val="left"/>
       <w:pPr>
-        <w:ind w:hanging="720" w:left="1800"/>
+        <w:ind w:left="1800" w:hanging="720"/>
       </w:pPr>
       <w:rPr>
         <w:rFonts w:hint="default"/>
@@ -860,7 +902,7 @@
       <w:lvlText w:val="%1.%2.%3.%4."/>
       <w:lvlJc w:val="left"/>
       <w:pPr>
-        <w:ind w:hanging="720" w:left="2160"/>
+        <w:ind w:left="2160" w:hanging="720"/>
       </w:pPr>
       <w:rPr>
         <w:rFonts w:hint="default"/>
@@ -873,7 +915,7 @@
       <w:lvlText w:val="%1.%2.%3.%4.%5."/>
       <w:lvlJc w:val="left"/>
       <w:pPr>
-        <w:ind w:hanging="1080" w:left="2880"/>
+        <w:ind w:left="2880" w:hanging="1080"/>
       </w:pPr>
       <w:rPr>
         <w:rFonts w:hint="default"/>
@@ -886,7 +928,7 @@
       <w:lvlText w:val="%1.%2.%3.%4.%5.%6."/>
       <w:lvlJc w:val="left"/>
       <w:pPr>
-        <w:ind w:hanging="1080" w:left="3240"/>
+        <w:ind w:left="3240" w:hanging="1080"/>
       </w:pPr>
       <w:rPr>
         <w:rFonts w:hint="default"/>
@@ -899,7 +941,7 @@
       <w:lvlText w:val="%1.%2.%3.%4.%5.%6.%7."/>
       <w:lvlJc w:val="left"/>
       <w:pPr>
-        <w:ind w:hanging="1440" w:left="3960"/>
+        <w:ind w:left="3960" w:hanging="1440"/>
       </w:pPr>
       <w:rPr>
         <w:rFonts w:hint="default"/>
@@ -912,7 +954,7 @@
       <w:lvlText w:val="%1.%2.%3.%4.%5.%6.%7.%8."/>
       <w:lvlJc w:val="left"/>
       <w:pPr>
-        <w:ind w:hanging="1440" w:left="4320"/>
+        <w:ind w:left="4320" w:hanging="1440"/>
       </w:pPr>
       <w:rPr>
         <w:rFonts w:hint="default"/>
@@ -925,14 +967,14 @@
       <w:lvlText w:val="%1.%2.%3.%4.%5.%6.%7.%8.%9."/>
       <w:lvlJc w:val="left"/>
       <w:pPr>
-        <w:ind w:hanging="1800" w:left="5040"/>
+        <w:ind w:left="5040" w:hanging="1800"/>
       </w:pPr>
       <w:rPr>
         <w:rFonts w:hint="default"/>
       </w:rPr>
     </w:lvl>
   </w:abstractNum>
-  <w:abstractNum w15:restartNumberingAfterBreak="0" w:abstractNumId="6">
+  <w:abstractNum w:abstractNumId="7" w15:restartNumberingAfterBreak="0">
     <w:nsid w:val="78D42EBB"/>
     <w:multiLevelType w:val="hybridMultilevel"/>
     <w:tmpl w:val="032C313E"/>
@@ -942,110 +984,110 @@
       <w:lvlText w:val=""/>
       <w:lvlJc w:val="left"/>
       <w:pPr>
-        <w:ind w:hanging="360" w:left="720"/>
+        <w:ind w:left="720" w:hanging="360"/>
       </w:pPr>
       <w:rPr>
         <w:rFonts w:ascii="Symbol" w:hAnsi="Symbol" w:hint="default"/>
       </w:rPr>
     </w:lvl>
-    <w:lvl w:ilvl="1" w:tentative="1" w:tplc="04090003">
+    <w:lvl w:ilvl="1" w:tplc="04090003" w:tentative="1">
       <w:start w:val="1"/>
       <w:numFmt w:val="bullet"/>
       <w:lvlText w:val="o"/>
       <w:lvlJc w:val="left"/>
       <w:pPr>
-        <w:ind w:hanging="360" w:left="1440"/>
-      </w:pPr>
-      <w:rPr>
-        <w:rFonts w:ascii="Courier New" w:cs="Courier New" w:hAnsi="Courier New" w:hint="default"/>
-      </w:rPr>
-    </w:lvl>
-    <w:lvl w:ilvl="2" w:tentative="1" w:tplc="04090005">
+        <w:ind w:left="1440" w:hanging="360"/>
+      </w:pPr>
+      <w:rPr>
+        <w:rFonts w:ascii="Courier New" w:hAnsi="Courier New" w:cs="Courier New" w:hint="default"/>
+      </w:rPr>
+    </w:lvl>
+    <w:lvl w:ilvl="2" w:tplc="04090005" w:tentative="1">
       <w:start w:val="1"/>
       <w:numFmt w:val="bullet"/>
       <w:lvlText w:val=""/>
       <w:lvlJc w:val="left"/>
       <w:pPr>
-        <w:ind w:hanging="360" w:left="2160"/>
+        <w:ind w:left="2160" w:hanging="360"/>
       </w:pPr>
       <w:rPr>
         <w:rFonts w:ascii="Wingdings" w:hAnsi="Wingdings" w:hint="default"/>
       </w:rPr>
     </w:lvl>
-    <w:lvl w:ilvl="3" w:tentative="1" w:tplc="04090001">
+    <w:lvl w:ilvl="3" w:tplc="04090001" w:tentative="1">
       <w:start w:val="1"/>
       <w:numFmt w:val="bullet"/>
       <w:lvlText w:val=""/>
       <w:lvlJc w:val="left"/>
       <w:pPr>
-        <w:ind w:hanging="360" w:left="2880"/>
+        <w:ind w:left="2880" w:hanging="360"/>
       </w:pPr>
       <w:rPr>
         <w:rFonts w:ascii="Symbol" w:hAnsi="Symbol" w:hint="default"/>
       </w:rPr>
     </w:lvl>
-    <w:lvl w:ilvl="4" w:tentative="1" w:tplc="04090003">
+    <w:lvl w:ilvl="4" w:tplc="04090003" w:tentative="1">
       <w:start w:val="1"/>
       <w:numFmt w:val="bullet"/>
       <w:lvlText w:val="o"/>
       <w:lvlJc w:val="left"/>
       <w:pPr>
-        <w:ind w:hanging="360" w:left="3600"/>
-      </w:pPr>
-      <w:rPr>
-        <w:rFonts w:ascii="Courier New" w:cs="Courier New" w:hAnsi="Courier New" w:hint="default"/>
-      </w:rPr>
-    </w:lvl>
-    <w:lvl w:ilvl="5" w:tentative="1" w:tplc="04090005">
+        <w:ind w:left="3600" w:hanging="360"/>
+      </w:pPr>
+      <w:rPr>
+        <w:rFonts w:ascii="Courier New" w:hAnsi="Courier New" w:cs="Courier New" w:hint="default"/>
+      </w:rPr>
+    </w:lvl>
+    <w:lvl w:ilvl="5" w:tplc="04090005" w:tentative="1">
       <w:start w:val="1"/>
       <w:numFmt w:val="bullet"/>
       <w:lvlText w:val=""/>
       <w:lvlJc w:val="left"/>
       <w:pPr>
-        <w:ind w:hanging="360" w:left="4320"/>
+        <w:ind w:left="4320" w:hanging="360"/>
       </w:pPr>
       <w:rPr>
         <w:rFonts w:ascii="Wingdings" w:hAnsi="Wingdings" w:hint="default"/>
       </w:rPr>
     </w:lvl>
-    <w:lvl w:ilvl="6" w:tentative="1" w:tplc="04090001">
+    <w:lvl w:ilvl="6" w:tplc="04090001" w:tentative="1">
       <w:start w:val="1"/>
       <w:numFmt w:val="bullet"/>
       <w:lvlText w:val=""/>
       <w:lvlJc w:val="left"/>
       <w:pPr>
-        <w:ind w:hanging="360" w:left="5040"/>
+        <w:ind w:left="5040" w:hanging="360"/>
       </w:pPr>
       <w:rPr>
         <w:rFonts w:ascii="Symbol" w:hAnsi="Symbol" w:hint="default"/>
       </w:rPr>
     </w:lvl>
-    <w:lvl w:ilvl="7" w:tentative="1" w:tplc="04090003">
+    <w:lvl w:ilvl="7" w:tplc="04090003" w:tentative="1">
       <w:start w:val="1"/>
       <w:numFmt w:val="bullet"/>
       <w:lvlText w:val="o"/>
       <w:lvlJc w:val="left"/>
       <w:pPr>
-        <w:ind w:hanging="360" w:left="5760"/>
-      </w:pPr>
-      <w:rPr>
-        <w:rFonts w:ascii="Courier New" w:cs="Courier New" w:hAnsi="Courier New" w:hint="default"/>
-      </w:rPr>
-    </w:lvl>
-    <w:lvl w:ilvl="8" w:tentative="1" w:tplc="04090005">
+        <w:ind w:left="5760" w:hanging="360"/>
+      </w:pPr>
+      <w:rPr>
+        <w:rFonts w:ascii="Courier New" w:hAnsi="Courier New" w:cs="Courier New" w:hint="default"/>
+      </w:rPr>
+    </w:lvl>
+    <w:lvl w:ilvl="8" w:tplc="04090005" w:tentative="1">
       <w:start w:val="1"/>
       <w:numFmt w:val="bullet"/>
       <w:lvlText w:val=""/>
       <w:lvlJc w:val="left"/>
       <w:pPr>
-        <w:ind w:hanging="360" w:left="6480"/>
+        <w:ind w:left="6480" w:hanging="360"/>
       </w:pPr>
       <w:rPr>
         <w:rFonts w:ascii="Wingdings" w:hAnsi="Wingdings" w:hint="default"/>
       </w:rPr>
     </w:lvl>
   </w:abstractNum>
-  <w:abstractNum w15:restartNumberingAfterBreak="0" w:abstractNumId="7">
+  <w:abstractNum w:abstractNumId="8" w15:restartNumberingAfterBreak="0">
     <w:nsid w:val="7EF31413"/>
     <w:multiLevelType w:val="hybridMultilevel"/>
     <w:tmpl w:val="061E1916"/>
@@ -1055,201 +1097,125 @@
       <w:lvlText w:val=""/>
       <w:lvlJc w:val="left"/>
       <w:pPr>
-        <w:ind w:hanging="360" w:left="720"/>
+        <w:ind w:left="720" w:hanging="360"/>
       </w:pPr>
       <w:rPr>
         <w:rFonts w:ascii="Symbol" w:hAnsi="Symbol" w:hint="default"/>
       </w:rPr>
     </w:lvl>
-    <w:lvl w:ilvl="1" w:tentative="1" w:tplc="FFFFFFFF">
+    <w:lvl w:ilvl="1" w:tplc="FFFFFFFF" w:tentative="1">
       <w:start w:val="1"/>
       <w:numFmt w:val="lowerLetter"/>
       <w:lvlText w:val="%2."/>
       <w:lvlJc w:val="left"/>
       <w:pPr>
-        <w:ind w:hanging="360" w:left="1440"/>
-      </w:pPr>
-    </w:lvl>
-    <w:lvl w:ilvl="2" w:tentative="1" w:tplc="FFFFFFFF">
+        <w:ind w:left="1440" w:hanging="360"/>
+      </w:pPr>
+    </w:lvl>
+    <w:lvl w:ilvl="2" w:tplc="FFFFFFFF" w:tentative="1">
       <w:start w:val="1"/>
       <w:numFmt w:val="lowerRoman"/>
       <w:lvlText w:val="%3."/>
       <w:lvlJc w:val="right"/>
       <w:pPr>
-        <w:ind w:hanging="180" w:left="2160"/>
-      </w:pPr>
-    </w:lvl>
-    <w:lvl w:ilvl="3" w:tentative="1" w:tplc="FFFFFFFF">
+        <w:ind w:left="2160" w:hanging="180"/>
+      </w:pPr>
+    </w:lvl>
+    <w:lvl w:ilvl="3" w:tplc="FFFFFFFF" w:tentative="1">
       <w:start w:val="1"/>
       <w:numFmt w:val="decimal"/>
       <w:lvlText w:val="%4."/>
       <w:lvlJc w:val="left"/>
       <w:pPr>
-        <w:ind w:hanging="360" w:left="2880"/>
-      </w:pPr>
-    </w:lvl>
-    <w:lvl w:ilvl="4" w:tentative="1" w:tplc="FFFFFFFF">
+        <w:ind w:left="2880" w:hanging="360"/>
+      </w:pPr>
+    </w:lvl>
+    <w:lvl w:ilvl="4" w:tplc="FFFFFFFF" w:tentative="1">
       <w:start w:val="1"/>
       <w:numFmt w:val="lowerLetter"/>
       <w:lvlText w:val="%5."/>
       <w:lvlJc w:val="left"/>
       <w:pPr>
-        <w:ind w:hanging="360" w:left="3600"/>
-      </w:pPr>
-    </w:lvl>
-    <w:lvl w:ilvl="5" w:tentative="1" w:tplc="FFFFFFFF">
+        <w:ind w:left="3600" w:hanging="360"/>
+      </w:pPr>
+    </w:lvl>
+    <w:lvl w:ilvl="5" w:tplc="FFFFFFFF" w:tentative="1">
       <w:start w:val="1"/>
       <w:numFmt w:val="lowerRoman"/>
       <w:lvlText w:val="%6."/>
       <w:lvlJc w:val="right"/>
       <w:pPr>
-        <w:ind w:hanging="180" w:left="4320"/>
-      </w:pPr>
-    </w:lvl>
-    <w:lvl w:ilvl="6" w:tentative="1" w:tplc="FFFFFFFF">
+        <w:ind w:left="4320" w:hanging="180"/>
+      </w:pPr>
+    </w:lvl>
+    <w:lvl w:ilvl="6" w:tplc="FFFFFFFF" w:tentative="1">
       <w:start w:val="1"/>
       <w:numFmt w:val="decimal"/>
       <w:lvlText w:val="%7."/>
       <w:lvlJc w:val="left"/>
       <w:pPr>
-        <w:ind w:hanging="360" w:left="5040"/>
-      </w:pPr>
-    </w:lvl>
-    <w:lvl w:ilvl="7" w:tentative="1" w:tplc="FFFFFFFF">
+        <w:ind w:left="5040" w:hanging="360"/>
+      </w:pPr>
+    </w:lvl>
+    <w:lvl w:ilvl="7" w:tplc="FFFFFFFF" w:tentative="1">
       <w:start w:val="1"/>
       <w:numFmt w:val="lowerLetter"/>
       <w:lvlText w:val="%8."/>
       <w:lvlJc w:val="left"/>
       <w:pPr>
-        <w:ind w:hanging="360" w:left="5760"/>
-      </w:pPr>
-    </w:lvl>
-    <w:lvl w:ilvl="8" w:tentative="1" w:tplc="FFFFFFFF">
+        <w:ind w:left="5760" w:hanging="360"/>
+      </w:pPr>
+    </w:lvl>
+    <w:lvl w:ilvl="8" w:tplc="FFFFFFFF" w:tentative="1">
       <w:start w:val="1"/>
       <w:numFmt w:val="lowerRoman"/>
       <w:lvlText w:val="%9."/>
       <w:lvlJc w:val="right"/>
       <w:pPr>
-        <w:ind w:hanging="180" w:left="6480"/>
+        <w:ind w:left="6480" w:hanging="180"/>
       </w:pPr>
     </w:lvl>
   </w:abstractNum>
-  <w:abstractNum w:abstractNumId="990">
-    <w:nsid w:val="0000A990"/>
-    <w:multiLevelType w:val="multilevel"/>
-    <w:lvl w:ilvl="0">
-      <w:numFmt w:val="bullet"/>
-      <w:lvlText w:val=" "/>
-      <w:lvlJc w:val="left"/>
-      <w:pPr>
-        <w:ind w:left="720" w:hanging="360"/>
-      </w:pPr>
-    </w:lvl>
-    <w:lvl w:ilvl="1">
-      <w:numFmt w:val="bullet"/>
-      <w:lvlText w:val=" "/>
-      <w:lvlJc w:val="left"/>
-      <w:pPr>
-        <w:ind w:left="1440" w:hanging="360"/>
-      </w:pPr>
-    </w:lvl>
-    <w:lvl w:ilvl="2">
-      <w:numFmt w:val="bullet"/>
-      <w:lvlText w:val=" "/>
-      <w:lvlJc w:val="left"/>
-      <w:pPr>
-        <w:ind w:left="2160" w:hanging="360"/>
-      </w:pPr>
-    </w:lvl>
-    <w:lvl w:ilvl="3">
-      <w:numFmt w:val="bullet"/>
-      <w:lvlText w:val=" "/>
-      <w:lvlJc w:val="left"/>
-      <w:pPr>
-        <w:ind w:left="2880" w:hanging="360"/>
-      </w:pPr>
-    </w:lvl>
-    <w:lvl w:ilvl="4">
-      <w:numFmt w:val="bullet"/>
-      <w:lvlText w:val=" "/>
-      <w:lvlJc w:val="left"/>
-      <w:pPr>
-        <w:ind w:left="3600" w:hanging="360"/>
-      </w:pPr>
-    </w:lvl>
-    <w:lvl w:ilvl="5">
-      <w:numFmt w:val="bullet"/>
-      <w:lvlText w:val=" "/>
-      <w:lvlJc w:val="left"/>
-      <w:pPr>
-        <w:ind w:left="4320" w:hanging="360"/>
-      </w:pPr>
-    </w:lvl>
-    <w:lvl w:ilvl="6">
-      <w:numFmt w:val="bullet"/>
-      <w:lvlText w:val=" "/>
-      <w:lvlJc w:val="left"/>
-      <w:pPr>
-        <w:ind w:left="5040" w:hanging="360"/>
-      </w:pPr>
-    </w:lvl>
-    <w:lvl w:ilvl="7">
-      <w:numFmt w:val="bullet"/>
-      <w:lvlText w:val=" "/>
-      <w:lvlJc w:val="left"/>
-      <w:pPr>
-        <w:ind w:left="5760" w:hanging="360"/>
-      </w:pPr>
-    </w:lvl>
-    <w:lvl w:ilvl="8">
-      <w:numFmt w:val="bullet"/>
-      <w:lvlText w:val=" "/>
-      <w:lvlJc w:val="left"/>
-      <w:pPr>
-        <w:ind w:left="6480" w:hanging="360"/>
-      </w:pPr>
-    </w:lvl>
-  </w:abstractNum>
-  <w:num w16cid:durableId="1038243658" w:numId="1">
+  <w:num w:numId="1" w16cid:durableId="1038243658">
+    <w:abstractNumId w:val="4"/>
+  </w:num>
+  <w:num w:numId="2" w16cid:durableId="1565873294">
+    <w:abstractNumId w:val="8"/>
+  </w:num>
+  <w:num w:numId="3" w16cid:durableId="267736538">
+    <w:abstractNumId w:val="1"/>
+  </w:num>
+  <w:num w:numId="4" w16cid:durableId="1398287614">
     <w:abstractNumId w:val="3"/>
   </w:num>
-  <w:num w16cid:durableId="1565873294" w:numId="2">
+  <w:num w:numId="5" w16cid:durableId="1141000816">
     <w:abstractNumId w:val="7"/>
   </w:num>
-  <w:num w16cid:durableId="267736538" w:numId="3">
-    <w:abstractNumId w:val="0"/>
+  <w:num w:numId="6" w16cid:durableId="1012145028">
+    <w:abstractNumId w:val="5"/>
   </w:num>
-  <w:num w16cid:durableId="1398287614" w:numId="4">
+  <w:num w:numId="7" w16cid:durableId="1060323516">
     <w:abstractNumId w:val="2"/>
   </w:num>
-  <w:num w16cid:durableId="1141000816" w:numId="5">
+  <w:num w:numId="8" w16cid:durableId="1050611009">
     <w:abstractNumId w:val="6"/>
   </w:num>
-  <w:num w16cid:durableId="1012145028" w:numId="6">
-    <w:abstractNumId w:val="4"/>
-  </w:num>
-  <w:num w16cid:durableId="1060323516" w:numId="7">
-    <w:abstractNumId w:val="1"/>
-  </w:num>
-  <w:num w16cid:durableId="1050611009" w:numId="8">
-    <w:abstractNumId w:val="5"/>
-  </w:num>
-  <w:num w:numId="1000">
-    <w:abstractNumId w:val="990"/>
+  <w:num w:numId="9" w16cid:durableId="1558475702">
+    <w:abstractNumId w:val="0"/>
   </w:num>
 </w:numbering>
 </file>
 
 <file path=word/styles.xml><?xml version="1.0" encoding="utf-8"?>
-<w:styles xmlns:mc="http://schemas.openxmlformats.org/markup-compatibility/2006" xmlns:r="http://schemas.openxmlformats.org/officeDocument/2006/relationships" xmlns:w="http://schemas.openxmlformats.org/wordprocessingml/2006/main" xmlns:w14="http://schemas.microsoft.com/office/word/2010/wordml" xmlns:w15="http://schemas.microsoft.com/office/word/2012/wordml" xmlns:w16="http://schemas.microsoft.com/office/word/2018/wordml" xmlns:w16cex="http://schemas.microsoft.com/office/word/2018/wordml/cex" xmlns:w16cid="http://schemas.microsoft.com/office/word/2016/wordml/cid" xmlns:w16du="http://schemas.microsoft.com/office/word/2023/wordml/word16du" xmlns:w16sdtdh="http://schemas.microsoft.com/office/word/2020/wordml/sdtdatahash" xmlns:w16sdtfl="http://schemas.microsoft.com/office/word/2024/wordml/sdtformatlock" xmlns:w16se="http://schemas.microsoft.com/office/word/2015/wordml/symex" mc:Ignorable="w14 w15 w16se w16cid w16 w16cex w16sdtdh w16sdtfl w16du">
+<w:styles xmlns:mc="http://schemas.openxmlformats.org/markup-compatibility/2006" xmlns:r="http://schemas.openxmlformats.org/officeDocument/2006/relationships" xmlns:w="http://schemas.openxmlformats.org/wordprocessingml/2006/main" xmlns:w14="http://schemas.microsoft.com/office/word/2010/wordml" xmlns:w15="http://schemas.microsoft.com/office/word/2012/wordml" xmlns:w16cex="http://schemas.microsoft.com/office/word/2018/wordml/cex" xmlns:w16cid="http://schemas.microsoft.com/office/word/2016/wordml/cid" xmlns:w16="http://schemas.microsoft.com/office/word/2018/wordml" xmlns:w16du="http://schemas.microsoft.com/office/word/2023/wordml/word16du" xmlns:w16sdtdh="http://schemas.microsoft.com/office/word/2020/wordml/sdtdatahash" xmlns:w16sdtfl="http://schemas.microsoft.com/office/word/2024/wordml/sdtformatlock" xmlns:w16se="http://schemas.microsoft.com/office/word/2015/wordml/symex" mc:Ignorable="w14 w15 w16se w16cid w16 w16cex w16sdtdh w16sdtfl w16du">
   <w:docDefaults>
     <w:rPrDefault>
       <w:rPr>
-        <w:rFonts w:asciiTheme="minorHAnsi" w:cstheme="minorBidi" w:eastAsiaTheme="minorHAnsi" w:hAnsiTheme="minorHAnsi"/>
+        <w:rFonts w:asciiTheme="minorHAnsi" w:eastAsiaTheme="minorHAnsi" w:hAnsiTheme="minorHAnsi" w:cstheme="minorBidi"/>
         <w:kern w:val="2"/>
         <w:sz w:val="24"/>
         <w:szCs w:val="24"/>
-        <w:lang w:bidi="ar-SA" w:eastAsia="en-US" w:val="es"/>
+        <w:lang w:val="es" w:eastAsia="en-US" w:bidi="ar-SA"/>
         <w14:ligatures w14:val="standardContextual"/>
       </w:rPr>
     </w:rPrDefault>
@@ -1259,17 +1225,17 @@
       </w:pPr>
     </w:pPrDefault>
   </w:docDefaults>
-  <w:latentStyles w:count="376" w:defLockedState="0" w:defQFormat="0" w:defSemiHidden="0" w:defUIPriority="99" w:defUnhideWhenUsed="0">
-    <w:lsdException w:name="Normal" w:qFormat="1" w:uiPriority="0"/>
-    <w:lsdException w:name="heading 1" w:qFormat="1" w:uiPriority="9"/>
-    <w:lsdException w:name="heading 2" w:qFormat="1" w:semiHidden="1" w:uiPriority="9" w:unhideWhenUsed="1"/>
-    <w:lsdException w:name="heading 3" w:qFormat="1" w:semiHidden="1" w:uiPriority="9" w:unhideWhenUsed="1"/>
-    <w:lsdException w:name="heading 4" w:qFormat="1" w:semiHidden="1" w:uiPriority="9" w:unhideWhenUsed="1"/>
-    <w:lsdException w:name="heading 5" w:qFormat="1" w:semiHidden="1" w:uiPriority="9" w:unhideWhenUsed="1"/>
-    <w:lsdException w:name="heading 6" w:qFormat="1" w:semiHidden="1" w:uiPriority="9" w:unhideWhenUsed="1"/>
-    <w:lsdException w:name="heading 7" w:qFormat="1" w:semiHidden="1" w:uiPriority="9" w:unhideWhenUsed="1"/>
-    <w:lsdException w:name="heading 8" w:qFormat="1" w:semiHidden="1" w:uiPriority="9" w:unhideWhenUsed="1"/>
-    <w:lsdException w:name="heading 9" w:qFormat="1" w:semiHidden="1" w:uiPriority="9" w:unhideWhenUsed="1"/>
+  <w:latentStyles w:defLockedState="0" w:defUIPriority="99" w:defSemiHidden="0" w:defUnhideWhenUsed="0" w:defQFormat="0" w:count="376">
+    <w:lsdException w:name="Normal" w:uiPriority="0" w:qFormat="1"/>
+    <w:lsdException w:name="heading 1" w:uiPriority="9" w:qFormat="1"/>
+    <w:lsdException w:name="heading 2" w:semiHidden="1" w:uiPriority="9" w:unhideWhenUsed="1" w:qFormat="1"/>
+    <w:lsdException w:name="heading 3" w:semiHidden="1" w:uiPriority="9" w:unhideWhenUsed="1" w:qFormat="1"/>
+    <w:lsdException w:name="heading 4" w:semiHidden="1" w:uiPriority="9" w:unhideWhenUsed="1" w:qFormat="1"/>
+    <w:lsdException w:name="heading 5" w:semiHidden="1" w:uiPriority="9" w:unhideWhenUsed="1" w:qFormat="1"/>
+    <w:lsdException w:name="heading 6" w:semiHidden="1" w:uiPriority="9" w:unhideWhenUsed="1" w:qFormat="1"/>
+    <w:lsdException w:name="heading 7" w:semiHidden="1" w:uiPriority="9" w:unhideWhenUsed="1" w:qFormat="1"/>
+    <w:lsdException w:name="heading 8" w:semiHidden="1" w:uiPriority="9" w:unhideWhenUsed="1" w:qFormat="1"/>
+    <w:lsdException w:name="heading 9" w:semiHidden="1" w:uiPriority="9" w:unhideWhenUsed="1" w:qFormat="1"/>
     <w:lsdException w:name="index 1" w:semiHidden="1" w:unhideWhenUsed="1"/>
     <w:lsdException w:name="index 2" w:semiHidden="1" w:unhideWhenUsed="1"/>
     <w:lsdException w:name="index 3" w:semiHidden="1" w:unhideWhenUsed="1"/>
@@ -1294,7 +1260,7 @@
     <w:lsdException w:name="header" w:semiHidden="1" w:unhideWhenUsed="1"/>
     <w:lsdException w:name="footer" w:semiHidden="1" w:unhideWhenUsed="1"/>
     <w:lsdException w:name="index heading" w:semiHidden="1" w:unhideWhenUsed="1"/>
-    <w:lsdException w:name="caption" w:qFormat="1" w:semiHidden="1" w:uiPriority="35" w:unhideWhenUsed="1"/>
+    <w:lsdException w:name="caption" w:semiHidden="1" w:uiPriority="35" w:unhideWhenUsed="1" w:qFormat="1"/>
     <w:lsdException w:name="table of figures" w:semiHidden="1" w:unhideWhenUsed="1"/>
     <w:lsdException w:name="envelope address" w:semiHidden="1" w:unhideWhenUsed="1"/>
     <w:lsdException w:name="envelope return" w:semiHidden="1" w:unhideWhenUsed="1"/>
@@ -1322,7 +1288,7 @@
     <w:lsdException w:name="List Number 3" w:semiHidden="1" w:unhideWhenUsed="1"/>
     <w:lsdException w:name="List Number 4" w:semiHidden="1" w:unhideWhenUsed="1"/>
     <w:lsdException w:name="List Number 5" w:semiHidden="1" w:unhideWhenUsed="1"/>
-    <w:lsdException w:name="Title" w:qFormat="1" w:uiPriority="10"/>
+    <w:lsdException w:name="Title" w:uiPriority="10" w:qFormat="1"/>
     <w:lsdException w:name="Closing" w:semiHidden="1" w:unhideWhenUsed="1"/>
     <w:lsdException w:name="Signature" w:semiHidden="1" w:unhideWhenUsed="1"/>
     <w:lsdException w:name="Default Paragraph Font" w:semiHidden="1" w:uiPriority="1" w:unhideWhenUsed="1"/>
@@ -1334,7 +1300,7 @@
     <w:lsdException w:name="List Continue 4" w:semiHidden="1" w:unhideWhenUsed="1"/>
     <w:lsdException w:name="List Continue 5" w:semiHidden="1" w:unhideWhenUsed="1"/>
     <w:lsdException w:name="Message Header" w:semiHidden="1" w:unhideWhenUsed="1"/>
-    <w:lsdException w:name="Subtitle" w:qFormat="1" w:uiPriority="11"/>
+    <w:lsdException w:name="Subtitle" w:uiPriority="11" w:qFormat="1"/>
     <w:lsdException w:name="Salutation" w:semiHidden="1" w:unhideWhenUsed="1"/>
     <w:lsdException w:name="Date" w:semiHidden="1" w:unhideWhenUsed="1"/>
     <w:lsdException w:name="Body Text First Indent" w:semiHidden="1" w:unhideWhenUsed="1"/>
@@ -1347,8 +1313,8 @@
     <w:lsdException w:name="Block Text" w:semiHidden="1" w:unhideWhenUsed="1"/>
     <w:lsdException w:name="Hyperlink" w:semiHidden="1" w:unhideWhenUsed="1"/>
     <w:lsdException w:name="FollowedHyperlink" w:semiHidden="1" w:unhideWhenUsed="1"/>
-    <w:lsdException w:name="Strong" w:qFormat="1" w:uiPriority="22"/>
-    <w:lsdException w:name="Emphasis" w:qFormat="1" w:uiPriority="20"/>
+    <w:lsdException w:name="Strong" w:uiPriority="22" w:qFormat="1"/>
+    <w:lsdException w:name="Emphasis" w:uiPriority="20" w:qFormat="1"/>
     <w:lsdException w:name="Document Map" w:semiHidden="1" w:unhideWhenUsed="1"/>
     <w:lsdException w:name="Plain Text" w:semiHidden="1" w:unhideWhenUsed="1"/>
     <w:lsdException w:name="E-mail Signature" w:semiHidden="1" w:unhideWhenUsed="1"/>
@@ -1417,7 +1383,7 @@
     <w:lsdException w:name="Table Grid" w:uiPriority="39"/>
     <w:lsdException w:name="Table Theme" w:semiHidden="1" w:unhideWhenUsed="1"/>
     <w:lsdException w:name="Placeholder Text" w:semiHidden="1"/>
-    <w:lsdException w:name="No Spacing" w:qFormat="1" w:uiPriority="1"/>
+    <w:lsdException w:name="No Spacing" w:uiPriority="1" w:qFormat="1"/>
     <w:lsdException w:name="Light Shading" w:uiPriority="60"/>
     <w:lsdException w:name="Light List" w:uiPriority="61"/>
     <w:lsdException w:name="Light Grid" w:uiPriority="62"/>
@@ -1439,9 +1405,9 @@
     <w:lsdException w:name="Medium Shading 2 Accent 1" w:uiPriority="64"/>
     <w:lsdException w:name="Medium List 1 Accent 1" w:uiPriority="65"/>
     <w:lsdException w:name="Revision" w:semiHidden="1"/>
-    <w:lsdException w:name="List Paragraph" w:qFormat="1" w:uiPriority="34"/>
-    <w:lsdException w:name="Quote" w:qFormat="1" w:uiPriority="29"/>
-    <w:lsdException w:name="Intense Quote" w:qFormat="1" w:uiPriority="30"/>
+    <w:lsdException w:name="List Paragraph" w:uiPriority="34" w:qFormat="1"/>
+    <w:lsdException w:name="Quote" w:uiPriority="29" w:qFormat="1"/>
+    <w:lsdException w:name="Intense Quote" w:uiPriority="30" w:qFormat="1"/>
     <w:lsdException w:name="Medium List 2 Accent 1" w:uiPriority="66"/>
     <w:lsdException w:name="Medium Grid 1 Accent 1" w:uiPriority="67"/>
     <w:lsdException w:name="Medium Grid 2 Accent 1" w:uiPriority="68"/>
@@ -1520,13 +1486,13 @@
     <w:lsdException w:name="Colorful Shading Accent 6" w:uiPriority="71"/>
     <w:lsdException w:name="Colorful List Accent 6" w:uiPriority="72"/>
     <w:lsdException w:name="Colorful Grid Accent 6" w:uiPriority="73"/>
-    <w:lsdException w:name="Subtle Emphasis" w:qFormat="1" w:uiPriority="19"/>
-    <w:lsdException w:name="Intense Emphasis" w:qFormat="1" w:uiPriority="21"/>
-    <w:lsdException w:name="Subtle Reference" w:qFormat="1" w:uiPriority="31"/>
-    <w:lsdException w:name="Intense Reference" w:qFormat="1" w:uiPriority="32"/>
-    <w:lsdException w:name="Book Title" w:qFormat="1" w:uiPriority="33"/>
+    <w:lsdException w:name="Subtle Emphasis" w:uiPriority="19" w:qFormat="1"/>
+    <w:lsdException w:name="Intense Emphasis" w:uiPriority="21" w:qFormat="1"/>
+    <w:lsdException w:name="Subtle Reference" w:uiPriority="31" w:qFormat="1"/>
+    <w:lsdException w:name="Intense Reference" w:uiPriority="32" w:qFormat="1"/>
+    <w:lsdException w:name="Book Title" w:uiPriority="33" w:qFormat="1"/>
     <w:lsdException w:name="Bibliography" w:semiHidden="1" w:uiPriority="37" w:unhideWhenUsed="1"/>
-    <w:lsdException w:name="TOC Heading" w:qFormat="1" w:semiHidden="1" w:uiPriority="39" w:unhideWhenUsed="1"/>
+    <w:lsdException w:name="TOC Heading" w:semiHidden="1" w:uiPriority="39" w:unhideWhenUsed="1" w:qFormat="1"/>
     <w:lsdException w:name="Plain Table 1" w:uiPriority="41"/>
     <w:lsdException w:name="Plain Table 2" w:uiPriority="42"/>
     <w:lsdException w:name="Plain Table 3" w:uiPriority="43"/>
@@ -1637,12 +1603,15 @@
     <w:lsdException w:name="Unresolved Mention" w:semiHidden="1" w:unhideWhenUsed="1"/>
     <w:lsdException w:name="Smart Link" w:semiHidden="1" w:unhideWhenUsed="1"/>
   </w:latentStyles>
-  <w:style w:default="1" w:styleId="Normal" w:type="paragraph">
+  <w:style w:type="paragraph" w:default="1" w:styleId="Normal">
     <w:name w:val="Normal"/>
     <w:qFormat/>
     <w:rsid w:val="00273429"/>
-  </w:style>
-  <w:style w:styleId="Heading1" w:type="paragraph">
+    <w:rPr>
+      <w:rFonts w:ascii="Times New Roman" w:hAnsi="Times New Roman" w:cs="Times New Roman"/>
+    </w:rPr>
+  </w:style>
+  <w:style w:type="paragraph" w:styleId="Heading1">
     <w:name w:val="heading 1"/>
     <w:basedOn w:val="Normal"/>
     <w:next w:val="Normal"/>
@@ -1653,17 +1622,18 @@
     <w:pPr>
       <w:keepNext/>
       <w:keepLines/>
-      <w:spacing w:after="80" w:before="360"/>
+      <w:spacing w:before="360" w:after="80"/>
       <w:outlineLvl w:val="0"/>
     </w:pPr>
     <w:rPr>
-      <w:rFonts w:asciiTheme="majorHAnsi" w:cstheme="majorBidi" w:eastAsiaTheme="majorEastAsia" w:hAnsiTheme="majorHAnsi"/>
-      <w:color w:themeColor="accent1" w:themeShade="BF" w:val="2F5496"/>
-      <w:sz w:val="40"/>
+      <w:rFonts w:eastAsiaTheme="majorEastAsia"/>
+      <w:b/>
+      <w:color w:val="000000"/>
+      <w:sz w:val="32"/>
       <w:szCs w:val="40"/>
     </w:rPr>
   </w:style>
-  <w:style w:styleId="Heading2" w:type="paragraph">
+  <w:style w:type="paragraph" w:styleId="Heading2">
     <w:name w:val="heading 2"/>
     <w:basedOn w:val="Normal"/>
     <w:next w:val="Normal"/>
@@ -1676,17 +1646,18 @@
     <w:pPr>
       <w:keepNext/>
       <w:keepLines/>
-      <w:spacing w:after="80" w:before="160"/>
+      <w:spacing w:before="160" w:after="80"/>
       <w:outlineLvl w:val="1"/>
     </w:pPr>
     <w:rPr>
-      <w:rFonts w:asciiTheme="majorHAnsi" w:cstheme="majorBidi" w:eastAsiaTheme="majorEastAsia" w:hAnsiTheme="majorHAnsi"/>
-      <w:color w:themeColor="accent1" w:themeShade="BF" w:val="2F5496"/>
-      <w:sz w:val="32"/>
+      <w:rFonts w:eastAsiaTheme="majorEastAsia"/>
+      <w:b/>
+      <w:color w:val="000000"/>
+      <w:sz w:val="28"/>
       <w:szCs w:val="32"/>
     </w:rPr>
   </w:style>
-  <w:style w:styleId="Heading3" w:type="paragraph">
+  <w:style w:type="paragraph" w:styleId="Heading3">
     <w:name w:val="heading 3"/>
     <w:basedOn w:val="Normal"/>
     <w:next w:val="Normal"/>
@@ -1699,17 +1670,17 @@
     <w:pPr>
       <w:keepNext/>
       <w:keepLines/>
-      <w:spacing w:after="80" w:before="160"/>
+      <w:spacing w:before="160" w:after="80"/>
       <w:outlineLvl w:val="2"/>
     </w:pPr>
     <w:rPr>
-      <w:rFonts w:cstheme="majorBidi" w:eastAsiaTheme="majorEastAsia"/>
-      <w:color w:themeColor="accent1" w:themeShade="BF" w:val="2F5496"/>
-      <w:sz w:val="28"/>
+      <w:rFonts w:eastAsiaTheme="majorEastAsia"/>
+      <w:b/>
+      <w:color w:val="000000"/>
       <w:szCs w:val="28"/>
     </w:rPr>
   </w:style>
-  <w:style w:styleId="Heading4" w:type="paragraph">
+  <w:style w:type="paragraph" w:styleId="Heading4">
     <w:name w:val="heading 4"/>
     <w:basedOn w:val="Normal"/>
     <w:next w:val="Normal"/>
@@ -1722,17 +1693,17 @@
     <w:pPr>
       <w:keepNext/>
       <w:keepLines/>
-      <w:spacing w:after="40" w:before="80"/>
+      <w:spacing w:before="80" w:after="40"/>
       <w:outlineLvl w:val="3"/>
     </w:pPr>
     <w:rPr>
-      <w:rFonts w:cstheme="majorBidi" w:eastAsiaTheme="majorEastAsia"/>
+      <w:rFonts w:eastAsiaTheme="majorEastAsia" w:cstheme="majorBidi"/>
       <w:i/>
       <w:iCs/>
-      <w:color w:themeColor="accent1" w:themeShade="BF" w:val="2F5496"/>
-    </w:rPr>
-  </w:style>
-  <w:style w:styleId="Heading5" w:type="paragraph">
+      <w:color w:val="2F5496" w:themeColor="accent1" w:themeShade="BF"/>
+    </w:rPr>
+  </w:style>
+  <w:style w:type="paragraph" w:styleId="Heading5">
     <w:name w:val="heading 5"/>
     <w:basedOn w:val="Normal"/>
     <w:next w:val="Normal"/>
@@ -1745,15 +1716,15 @@
     <w:pPr>
       <w:keepNext/>
       <w:keepLines/>
-      <w:spacing w:after="40" w:before="80"/>
+      <w:spacing w:before="80" w:after="40"/>
       <w:outlineLvl w:val="4"/>
     </w:pPr>
     <w:rPr>
-      <w:rFonts w:cstheme="majorBidi" w:eastAsiaTheme="majorEastAsia"/>
-      <w:color w:themeColor="accent1" w:themeShade="BF" w:val="2F5496"/>
-    </w:rPr>
-  </w:style>
-  <w:style w:styleId="Heading6" w:type="paragraph">
+      <w:rFonts w:eastAsiaTheme="majorEastAsia" w:cstheme="majorBidi"/>
+      <w:color w:val="2F5496" w:themeColor="accent1" w:themeShade="BF"/>
+    </w:rPr>
+  </w:style>
+  <w:style w:type="paragraph" w:styleId="Heading6">
     <w:name w:val="heading 6"/>
     <w:basedOn w:val="Normal"/>
     <w:next w:val="Normal"/>
@@ -1766,17 +1737,17 @@
     <w:pPr>
       <w:keepNext/>
       <w:keepLines/>
-      <w:spacing w:after="0" w:before="40"/>
+      <w:spacing w:before="40" w:after="0"/>
       <w:outlineLvl w:val="5"/>
     </w:pPr>
     <w:rPr>
-      <w:rFonts w:cstheme="majorBidi" w:eastAsiaTheme="majorEastAsia"/>
+      <w:rFonts w:eastAsiaTheme="majorEastAsia" w:cstheme="majorBidi"/>
       <w:i/>
       <w:iCs/>
-      <w:color w:themeColor="text1" w:themeTint="A6" w:val="595959"/>
-    </w:rPr>
-  </w:style>
-  <w:style w:styleId="Heading7" w:type="paragraph">
+      <w:color w:val="595959" w:themeColor="text1" w:themeTint="A6"/>
+    </w:rPr>
+  </w:style>
+  <w:style w:type="paragraph" w:styleId="Heading7">
     <w:name w:val="heading 7"/>
     <w:basedOn w:val="Normal"/>
     <w:next w:val="Normal"/>
@@ -1789,15 +1760,15 @@
     <w:pPr>
       <w:keepNext/>
       <w:keepLines/>
-      <w:spacing w:after="0" w:before="40"/>
+      <w:spacing w:before="40" w:after="0"/>
       <w:outlineLvl w:val="6"/>
     </w:pPr>
     <w:rPr>
-      <w:rFonts w:cstheme="majorBidi" w:eastAsiaTheme="majorEastAsia"/>
-      <w:color w:themeColor="text1" w:themeTint="A6" w:val="595959"/>
-    </w:rPr>
-  </w:style>
-  <w:style w:styleId="Heading8" w:type="paragraph">
+      <w:rFonts w:eastAsiaTheme="majorEastAsia" w:cstheme="majorBidi"/>
+      <w:color w:val="595959" w:themeColor="text1" w:themeTint="A6"/>
+    </w:rPr>
+  </w:style>
+  <w:style w:type="paragraph" w:styleId="Heading8">
     <w:name w:val="heading 8"/>
     <w:basedOn w:val="Normal"/>
     <w:next w:val="Normal"/>
@@ -1814,13 +1785,13 @@
       <w:outlineLvl w:val="7"/>
     </w:pPr>
     <w:rPr>
-      <w:rFonts w:cstheme="majorBidi" w:eastAsiaTheme="majorEastAsia"/>
+      <w:rFonts w:eastAsiaTheme="majorEastAsia" w:cstheme="majorBidi"/>
       <w:i/>
       <w:iCs/>
-      <w:color w:themeColor="text1" w:themeTint="D8" w:val="272727"/>
-    </w:rPr>
-  </w:style>
-  <w:style w:styleId="Heading9" w:type="paragraph">
+      <w:color w:val="272727" w:themeColor="text1" w:themeTint="D8"/>
+    </w:rPr>
+  </w:style>
+  <w:style w:type="paragraph" w:styleId="Heading9">
     <w:name w:val="heading 9"/>
     <w:basedOn w:val="Normal"/>
     <w:next w:val="Normal"/>
@@ -1837,51 +1808,52 @@
       <w:outlineLvl w:val="8"/>
     </w:pPr>
     <w:rPr>
-      <w:rFonts w:cstheme="majorBidi" w:eastAsiaTheme="majorEastAsia"/>
-      <w:color w:themeColor="text1" w:themeTint="D8" w:val="272727"/>
-    </w:rPr>
-  </w:style>
-  <w:style w:default="1" w:styleId="DefaultParagraphFont" w:type="character">
+      <w:rFonts w:eastAsiaTheme="majorEastAsia" w:cstheme="majorBidi"/>
+      <w:color w:val="272727" w:themeColor="text1" w:themeTint="D8"/>
+    </w:rPr>
+  </w:style>
+  <w:style w:type="character" w:default="1" w:styleId="DefaultParagraphFont">
     <w:name w:val="Default Paragraph Font"/>
     <w:uiPriority w:val="1"/>
     <w:semiHidden/>
     <w:unhideWhenUsed/>
   </w:style>
-  <w:style w:default="1" w:styleId="TableNormal" w:type="table">
+  <w:style w:type="table" w:default="1" w:styleId="TableNormal">
     <w:name w:val="Normal Table"/>
     <w:uiPriority w:val="99"/>
     <w:semiHidden/>
     <w:unhideWhenUsed/>
     <w:tblPr>
-      <w:tblInd w:type="dxa" w:w="0"/>
+      <w:tblInd w:w="0" w:type="dxa"/>
       <w:tblCellMar>
-        <w:top w:type="dxa" w:w="0"/>
-        <w:left w:type="dxa" w:w="108"/>
-        <w:bottom w:type="dxa" w:w="0"/>
-        <w:right w:type="dxa" w:w="108"/>
+        <w:top w:w="0" w:type="dxa"/>
+        <w:left w:w="108" w:type="dxa"/>
+        <w:bottom w:w="0" w:type="dxa"/>
+        <w:right w:w="108" w:type="dxa"/>
       </w:tblCellMar>
     </w:tblPr>
   </w:style>
-  <w:style w:default="1" w:styleId="NoList" w:type="numbering">
+  <w:style w:type="numbering" w:default="1" w:styleId="NoList">
     <w:name w:val="No List"/>
     <w:uiPriority w:val="99"/>
     <w:semiHidden/>
     <w:unhideWhenUsed/>
   </w:style>
-  <w:style w:customStyle="1" w:styleId="Heading1Char" w:type="character">
+  <w:style w:type="character" w:customStyle="1" w:styleId="Heading1Char">
     <w:name w:val="Heading 1 Char"/>
     <w:basedOn w:val="DefaultParagraphFont"/>
     <w:link w:val="Heading1"/>
     <w:uiPriority w:val="9"/>
     <w:rsid w:val="00273429"/>
     <w:rPr>
-      <w:rFonts w:asciiTheme="majorHAnsi" w:cstheme="majorBidi" w:eastAsiaTheme="majorEastAsia" w:hAnsiTheme="majorHAnsi"/>
-      <w:color w:themeColor="accent1" w:themeShade="BF" w:val="2F5496"/>
-      <w:sz w:val="40"/>
+      <w:rFonts w:ascii="Times New Roman" w:eastAsiaTheme="majorEastAsia" w:hAnsi="Times New Roman" w:cs="Times New Roman"/>
+      <w:b/>
+      <w:color w:val="000000"/>
+      <w:sz w:val="32"/>
       <w:szCs w:val="40"/>
     </w:rPr>
   </w:style>
-  <w:style w:customStyle="1" w:styleId="Heading2Char" w:type="character">
+  <w:style w:type="character" w:customStyle="1" w:styleId="Heading2Char">
     <w:name w:val="Heading 2 Char"/>
     <w:basedOn w:val="DefaultParagraphFont"/>
     <w:link w:val="Heading2"/>
@@ -1889,13 +1861,14 @@
     <w:semiHidden/>
     <w:rsid w:val="00273429"/>
     <w:rPr>
-      <w:rFonts w:asciiTheme="majorHAnsi" w:cstheme="majorBidi" w:eastAsiaTheme="majorEastAsia" w:hAnsiTheme="majorHAnsi"/>
-      <w:color w:themeColor="accent1" w:themeShade="BF" w:val="2F5496"/>
-      <w:sz w:val="32"/>
+      <w:rFonts w:ascii="Times New Roman" w:eastAsiaTheme="majorEastAsia" w:hAnsi="Times New Roman" w:cs="Times New Roman"/>
+      <w:b/>
+      <w:color w:val="000000"/>
+      <w:sz w:val="28"/>
       <w:szCs w:val="32"/>
     </w:rPr>
   </w:style>
-  <w:style w:customStyle="1" w:styleId="Heading3Char" w:type="character">
+  <w:style w:type="character" w:customStyle="1" w:styleId="Heading3Char">
     <w:name w:val="Heading 3 Char"/>
     <w:basedOn w:val="DefaultParagraphFont"/>
     <w:link w:val="Heading3"/>
@@ -1903,13 +1876,13 @@
     <w:semiHidden/>
     <w:rsid w:val="00273429"/>
     <w:rPr>
-      <w:rFonts w:cstheme="majorBidi" w:eastAsiaTheme="majorEastAsia"/>
-      <w:color w:themeColor="accent1" w:themeShade="BF" w:val="2F5496"/>
-      <w:sz w:val="28"/>
+      <w:rFonts w:ascii="Times New Roman" w:eastAsiaTheme="majorEastAsia" w:hAnsi="Times New Roman" w:cs="Times New Roman"/>
+      <w:b/>
+      <w:color w:val="000000"/>
       <w:szCs w:val="28"/>
     </w:rPr>
   </w:style>
-  <w:style w:customStyle="1" w:styleId="Heading4Char" w:type="character">
+  <w:style w:type="character" w:customStyle="1" w:styleId="Heading4Char">
     <w:name w:val="Heading 4 Char"/>
     <w:basedOn w:val="DefaultParagraphFont"/>
     <w:link w:val="Heading4"/>
@@ -1917,13 +1890,13 @@
     <w:semiHidden/>
     <w:rsid w:val="00273429"/>
     <w:rPr>
-      <w:rFonts w:cstheme="majorBidi" w:eastAsiaTheme="majorEastAsia"/>
+      <w:rFonts w:eastAsiaTheme="majorEastAsia" w:cstheme="majorBidi"/>
       <w:i/>
       <w:iCs/>
-      <w:color w:themeColor="accent1" w:themeShade="BF" w:val="2F5496"/>
-    </w:rPr>
-  </w:style>
-  <w:style w:customStyle="1" w:styleId="Heading5Char" w:type="character">
+      <w:color w:val="2F5496" w:themeColor="accent1" w:themeShade="BF"/>
+    </w:rPr>
+  </w:style>
+  <w:style w:type="character" w:customStyle="1" w:styleId="Heading5Char">
     <w:name w:val="Heading 5 Char"/>
     <w:basedOn w:val="DefaultParagraphFont"/>
     <w:link w:val="Heading5"/>
@@ -1931,11 +1904,11 @@
     <w:semiHidden/>
     <w:rsid w:val="00273429"/>
     <w:rPr>
-      <w:rFonts w:cstheme="majorBidi" w:eastAsiaTheme="majorEastAsia"/>
-      <w:color w:themeColor="accent1" w:themeShade="BF" w:val="2F5496"/>
-    </w:rPr>
-  </w:style>
-  <w:style w:customStyle="1" w:styleId="Heading6Char" w:type="character">
+      <w:rFonts w:eastAsiaTheme="majorEastAsia" w:cstheme="majorBidi"/>
+      <w:color w:val="2F5496" w:themeColor="accent1" w:themeShade="BF"/>
+    </w:rPr>
+  </w:style>
+  <w:style w:type="character" w:customStyle="1" w:styleId="Heading6Char">
     <w:name w:val="Heading 6 Char"/>
     <w:basedOn w:val="DefaultParagraphFont"/>
     <w:link w:val="Heading6"/>
@@ -1943,13 +1916,13 @@
     <w:semiHidden/>
     <w:rsid w:val="00273429"/>
     <w:rPr>
-      <w:rFonts w:cstheme="majorBidi" w:eastAsiaTheme="majorEastAsia"/>
+      <w:rFonts w:eastAsiaTheme="majorEastAsia" w:cstheme="majorBidi"/>
       <w:i/>
       <w:iCs/>
-      <w:color w:themeColor="text1" w:themeTint="A6" w:val="595959"/>
-    </w:rPr>
-  </w:style>
-  <w:style w:customStyle="1" w:styleId="Heading7Char" w:type="character">
+      <w:color w:val="595959" w:themeColor="text1" w:themeTint="A6"/>
+    </w:rPr>
+  </w:style>
+  <w:style w:type="character" w:customStyle="1" w:styleId="Heading7Char">
     <w:name w:val="Heading 7 Char"/>
     <w:basedOn w:val="DefaultParagraphFont"/>
     <w:link w:val="Heading7"/>
@@ -1957,11 +1930,11 @@
     <w:semiHidden/>
     <w:rsid w:val="00273429"/>
     <w:rPr>
-      <w:rFonts w:cstheme="majorBidi" w:eastAsiaTheme="majorEastAsia"/>
-      <w:color w:themeColor="text1" w:themeTint="A6" w:val="595959"/>
-    </w:rPr>
-  </w:style>
-  <w:style w:customStyle="1" w:styleId="Heading8Char" w:type="character">
+      <w:rFonts w:eastAsiaTheme="majorEastAsia" w:cstheme="majorBidi"/>
+      <w:color w:val="595959" w:themeColor="text1" w:themeTint="A6"/>
+    </w:rPr>
+  </w:style>
+  <w:style w:type="character" w:customStyle="1" w:styleId="Heading8Char">
     <w:name w:val="Heading 8 Char"/>
     <w:basedOn w:val="DefaultParagraphFont"/>
     <w:link w:val="Heading8"/>
@@ -1969,13 +1942,13 @@
     <w:semiHidden/>
     <w:rsid w:val="00273429"/>
     <w:rPr>
-      <w:rFonts w:cstheme="majorBidi" w:eastAsiaTheme="majorEastAsia"/>
+      <w:rFonts w:eastAsiaTheme="majorEastAsia" w:cstheme="majorBidi"/>
       <w:i/>
       <w:iCs/>
-      <w:color w:themeColor="text1" w:themeTint="D8" w:val="272727"/>
-    </w:rPr>
-  </w:style>
-  <w:style w:customStyle="1" w:styleId="Heading9Char" w:type="character">
+      <w:color w:val="272727" w:themeColor="text1" w:themeTint="D8"/>
+    </w:rPr>
+  </w:style>
+  <w:style w:type="character" w:customStyle="1" w:styleId="Heading9Char">
     <w:name w:val="Heading 9 Char"/>
     <w:basedOn w:val="DefaultParagraphFont"/>
     <w:link w:val="Heading9"/>
@@ -1983,11 +1956,11 @@
     <w:semiHidden/>
     <w:rsid w:val="00273429"/>
     <w:rPr>
-      <w:rFonts w:cstheme="majorBidi" w:eastAsiaTheme="majorEastAsia"/>
-      <w:color w:themeColor="text1" w:themeTint="D8" w:val="272727"/>
-    </w:rPr>
-  </w:style>
-  <w:style w:styleId="Title" w:type="paragraph">
+      <w:rFonts w:eastAsiaTheme="majorEastAsia" w:cstheme="majorBidi"/>
+      <w:color w:val="272727" w:themeColor="text1" w:themeTint="D8"/>
+    </w:rPr>
+  </w:style>
+  <w:style w:type="paragraph" w:styleId="Title">
     <w:name w:val="Title"/>
     <w:basedOn w:val="Normal"/>
     <w:next w:val="Normal"/>
@@ -2000,28 +1973,28 @@
       <w:contextualSpacing/>
     </w:pPr>
     <w:rPr>
-      <w:rFonts w:asciiTheme="majorHAnsi" w:cstheme="majorBidi" w:eastAsiaTheme="majorEastAsia" w:hAnsiTheme="majorHAnsi"/>
+      <w:rFonts w:asciiTheme="majorHAnsi" w:eastAsiaTheme="majorEastAsia" w:hAnsiTheme="majorHAnsi" w:cstheme="majorBidi"/>
       <w:spacing w:val="-10"/>
       <w:kern w:val="28"/>
       <w:sz w:val="56"/>
       <w:szCs w:val="56"/>
     </w:rPr>
   </w:style>
-  <w:style w:customStyle="1" w:styleId="TitleChar" w:type="character">
+  <w:style w:type="character" w:customStyle="1" w:styleId="TitleChar">
     <w:name w:val="Title Char"/>
     <w:basedOn w:val="DefaultParagraphFont"/>
     <w:link w:val="Title"/>
     <w:uiPriority w:val="10"/>
     <w:rsid w:val="00273429"/>
     <w:rPr>
-      <w:rFonts w:asciiTheme="majorHAnsi" w:cstheme="majorBidi" w:eastAsiaTheme="majorEastAsia" w:hAnsiTheme="majorHAnsi"/>
+      <w:rFonts w:asciiTheme="majorHAnsi" w:eastAsiaTheme="majorEastAsia" w:hAnsiTheme="majorHAnsi" w:cstheme="majorBidi"/>
       <w:spacing w:val="-10"/>
       <w:kern w:val="28"/>
       <w:sz w:val="56"/>
       <w:szCs w:val="56"/>
     </w:rPr>
   </w:style>
-  <w:style w:styleId="Subtitle" w:type="paragraph">
+  <w:style w:type="paragraph" w:styleId="Subtitle">
     <w:name w:val="Subtitle"/>
     <w:basedOn w:val="Normal"/>
     <w:next w:val="Normal"/>
@@ -2035,28 +2008,28 @@
       </w:numPr>
     </w:pPr>
     <w:rPr>
-      <w:rFonts w:cstheme="majorBidi" w:eastAsiaTheme="majorEastAsia"/>
-      <w:color w:themeColor="text1" w:themeTint="A6" w:val="595959"/>
+      <w:rFonts w:eastAsiaTheme="majorEastAsia" w:cstheme="majorBidi"/>
+      <w:color w:val="595959" w:themeColor="text1" w:themeTint="A6"/>
       <w:spacing w:val="15"/>
       <w:sz w:val="28"/>
       <w:szCs w:val="28"/>
     </w:rPr>
   </w:style>
-  <w:style w:customStyle="1" w:styleId="SubtitleChar" w:type="character">
+  <w:style w:type="character" w:customStyle="1" w:styleId="SubtitleChar">
     <w:name w:val="Subtitle Char"/>
     <w:basedOn w:val="DefaultParagraphFont"/>
     <w:link w:val="Subtitle"/>
     <w:uiPriority w:val="11"/>
     <w:rsid w:val="00273429"/>
     <w:rPr>
-      <w:rFonts w:cstheme="majorBidi" w:eastAsiaTheme="majorEastAsia"/>
-      <w:color w:themeColor="text1" w:themeTint="A6" w:val="595959"/>
+      <w:rFonts w:eastAsiaTheme="majorEastAsia" w:cstheme="majorBidi"/>
+      <w:color w:val="595959" w:themeColor="text1" w:themeTint="A6"/>
       <w:spacing w:val="15"/>
       <w:sz w:val="28"/>
       <w:szCs w:val="28"/>
     </w:rPr>
   </w:style>
-  <w:style w:styleId="Quote" w:type="paragraph">
+  <w:style w:type="paragraph" w:styleId="Quote">
     <w:name w:val="Quote"/>
     <w:basedOn w:val="Normal"/>
     <w:next w:val="Normal"/>
@@ -2071,10 +2044,10 @@
     <w:rPr>
       <w:i/>
       <w:iCs/>
-      <w:color w:themeColor="text1" w:themeTint="BF" w:val="404040"/>
-    </w:rPr>
-  </w:style>
-  <w:style w:customStyle="1" w:styleId="QuoteChar" w:type="character">
+      <w:color w:val="404040" w:themeColor="text1" w:themeTint="BF"/>
+    </w:rPr>
+  </w:style>
+  <w:style w:type="character" w:customStyle="1" w:styleId="QuoteChar">
     <w:name w:val="Quote Char"/>
     <w:basedOn w:val="DefaultParagraphFont"/>
     <w:link w:val="Quote"/>
@@ -2083,10 +2056,10 @@
     <w:rPr>
       <w:i/>
       <w:iCs/>
-      <w:color w:themeColor="text1" w:themeTint="BF" w:val="404040"/>
-    </w:rPr>
-  </w:style>
-  <w:style w:styleId="ListParagraph" w:type="paragraph">
+      <w:color w:val="404040" w:themeColor="text1" w:themeTint="BF"/>
+    </w:rPr>
+  </w:style>
+  <w:style w:type="paragraph" w:styleId="ListParagraph">
     <w:name w:val="List Paragraph"/>
     <w:basedOn w:val="Normal"/>
     <w:uiPriority w:val="34"/>
@@ -2097,7 +2070,7 @@
       <w:contextualSpacing/>
     </w:pPr>
   </w:style>
-  <w:style w:styleId="IntenseEmphasis" w:type="character">
+  <w:style w:type="character" w:styleId="IntenseEmphasis">
     <w:name w:val="Intense Emphasis"/>
     <w:basedOn w:val="DefaultParagraphFont"/>
     <w:uiPriority w:val="21"/>
@@ -2106,10 +2079,10 @@
     <w:rPr>
       <w:i/>
       <w:iCs/>
-      <w:color w:themeColor="accent1" w:themeShade="BF" w:val="2F5496"/>
-    </w:rPr>
-  </w:style>
-  <w:style w:styleId="IntenseQuote" w:type="paragraph">
+      <w:color w:val="2F5496" w:themeColor="accent1" w:themeShade="BF"/>
+    </w:rPr>
+  </w:style>
+  <w:style w:type="paragraph" w:styleId="IntenseQuote">
     <w:name w:val="Intense Quote"/>
     <w:basedOn w:val="Normal"/>
     <w:next w:val="Normal"/>
@@ -2119,20 +2092,20 @@
     <w:rsid w:val="00273429"/>
     <w:pPr>
       <w:pBdr>
-        <w:top w:color="2F5496" w:space="10" w:sz="4" w:themeColor="accent1" w:themeShade="BF" w:val="single"/>
-        <w:bottom w:color="2F5496" w:space="10" w:sz="4" w:themeColor="accent1" w:themeShade="BF" w:val="single"/>
+        <w:top w:val="single" w:sz="4" w:space="10" w:color="2F5496" w:themeColor="accent1" w:themeShade="BF"/>
+        <w:bottom w:val="single" w:sz="4" w:space="10" w:color="2F5496" w:themeColor="accent1" w:themeShade="BF"/>
       </w:pBdr>
-      <w:spacing w:after="360" w:before="360"/>
+      <w:spacing w:before="360" w:after="360"/>
       <w:ind w:left="864" w:right="864"/>
       <w:jc w:val="center"/>
     </w:pPr>
     <w:rPr>
       <w:i/>
       <w:iCs/>
-      <w:color w:themeColor="accent1" w:themeShade="BF" w:val="2F5496"/>
-    </w:rPr>
-  </w:style>
-  <w:style w:customStyle="1" w:styleId="IntenseQuoteChar" w:type="character">
+      <w:color w:val="2F5496" w:themeColor="accent1" w:themeShade="BF"/>
+    </w:rPr>
+  </w:style>
+  <w:style w:type="character" w:customStyle="1" w:styleId="IntenseQuoteChar">
     <w:name w:val="Intense Quote Char"/>
     <w:basedOn w:val="DefaultParagraphFont"/>
     <w:link w:val="IntenseQuote"/>
@@ -2141,10 +2114,10 @@
     <w:rPr>
       <w:i/>
       <w:iCs/>
-      <w:color w:themeColor="accent1" w:themeShade="BF" w:val="2F5496"/>
-    </w:rPr>
-  </w:style>
-  <w:style w:styleId="IntenseReference" w:type="character">
+      <w:color w:val="2F5496" w:themeColor="accent1" w:themeShade="BF"/>
+    </w:rPr>
+  </w:style>
+  <w:style w:type="character" w:styleId="IntenseReference">
     <w:name w:val="Intense Reference"/>
     <w:basedOn w:val="DefaultParagraphFont"/>
     <w:uiPriority w:val="32"/>
@@ -2154,11 +2127,11 @@
       <w:b/>
       <w:bCs/>
       <w:smallCaps/>
-      <w:color w:themeColor="accent1" w:themeShade="BF" w:val="2F5496"/>
+      <w:color w:val="2F5496" w:themeColor="accent1" w:themeShade="BF"/>
       <w:spacing w:val="5"/>
     </w:rPr>
   </w:style>
-  <w:style w:styleId="TableGrid" w:type="table">
+  <w:style w:type="table" w:styleId="TableGrid">
     <w:name w:val="Table Grid"/>
     <w:basedOn w:val="TableNormal"/>
     <w:uiPriority w:val="39"/>
@@ -2168,26 +2141,24 @@
     </w:pPr>
     <w:tblPr>
       <w:tblBorders>
-        <w:top w:color="auto" w:space="0" w:sz="4" w:val="single"/>
-        <w:left w:color="auto" w:space="0" w:sz="4" w:val="single"/>
-        <w:bottom w:color="auto" w:space="0" w:sz="4" w:val="single"/>
-        <w:right w:color="auto" w:space="0" w:sz="4" w:val="single"/>
-        <w:insideH w:color="auto" w:space="0" w:sz="4" w:val="single"/>
-        <w:insideV w:color="auto" w:space="0" w:sz="4" w:val="single"/>
+        <w:top w:val="single" w:sz="4" w:space="0" w:color="auto"/>
+        <w:left w:val="single" w:sz="4" w:space="0" w:color="auto"/>
+        <w:bottom w:val="single" w:sz="4" w:space="0" w:color="auto"/>
+        <w:right w:val="single" w:sz="4" w:space="0" w:color="auto"/>
+        <w:insideH w:val="single" w:sz="4" w:space="0" w:color="auto"/>
+        <w:insideV w:val="single" w:sz="4" w:space="0" w:color="auto"/>
       </w:tblBorders>
     </w:tblPr>
   </w:style>
   <w:style w:type="paragraph" w:customStyle="1" w:styleId="SourceCode">
     <w:name w:val="Source Code"/>
     <w:basedOn w:val="Normal"/>
-    <w:link w:val="VerbatimChar"/>
     <w:pPr>
-      <w:wordWrap w:val="off"/>
+      <w:wordWrap w:val="0"/>
     </w:pPr>
   </w:style>
   <w:style w:type="character" w:customStyle="1" w:styleId="KeywordTok">
     <w:name w:val="KeywordTok"/>
-    <w:basedOn w:val="VerbatimChar"/>
     <w:rPr>
       <w:b/>
       <w:color w:val="007020"/>
@@ -2195,77 +2166,66 @@
   </w:style>
   <w:style w:type="character" w:customStyle="1" w:styleId="DataTypeTok">
     <w:name w:val="DataTypeTok"/>
-    <w:basedOn w:val="VerbatimChar"/>
     <w:rPr>
       <w:color w:val="902000"/>
     </w:rPr>
   </w:style>
   <w:style w:type="character" w:customStyle="1" w:styleId="DecValTok">
     <w:name w:val="DecValTok"/>
-    <w:basedOn w:val="VerbatimChar"/>
-    <w:rPr>
-      <w:color w:val="40a070"/>
+    <w:rPr>
+      <w:color w:val="40A070"/>
     </w:rPr>
   </w:style>
   <w:style w:type="character" w:customStyle="1" w:styleId="BaseNTok">
     <w:name w:val="BaseNTok"/>
-    <w:basedOn w:val="VerbatimChar"/>
-    <w:rPr>
-      <w:color w:val="40a070"/>
+    <w:rPr>
+      <w:color w:val="40A070"/>
     </w:rPr>
   </w:style>
   <w:style w:type="character" w:customStyle="1" w:styleId="FloatTok">
     <w:name w:val="FloatTok"/>
-    <w:basedOn w:val="VerbatimChar"/>
-    <w:rPr>
-      <w:color w:val="40a070"/>
+    <w:rPr>
+      <w:color w:val="40A070"/>
     </w:rPr>
   </w:style>
   <w:style w:type="character" w:customStyle="1" w:styleId="ConstantTok">
     <w:name w:val="ConstantTok"/>
-    <w:basedOn w:val="VerbatimChar"/>
     <w:rPr>
       <w:color w:val="880000"/>
     </w:rPr>
   </w:style>
   <w:style w:type="character" w:customStyle="1" w:styleId="CharTok">
     <w:name w:val="CharTok"/>
-    <w:basedOn w:val="VerbatimChar"/>
-    <w:rPr>
-      <w:color w:val="4070a0"/>
+    <w:rPr>
+      <w:color w:val="4070A0"/>
     </w:rPr>
   </w:style>
   <w:style w:type="character" w:customStyle="1" w:styleId="SpecialCharTok">
     <w:name w:val="SpecialCharTok"/>
-    <w:basedOn w:val="VerbatimChar"/>
-    <w:rPr>
-      <w:color w:val="4070a0"/>
+    <w:rPr>
+      <w:color w:val="4070A0"/>
     </w:rPr>
   </w:style>
   <w:style w:type="character" w:customStyle="1" w:styleId="StringTok">
     <w:name w:val="StringTok"/>
-    <w:basedOn w:val="VerbatimChar"/>
-    <w:rPr>
-      <w:color w:val="4070a0"/>
+    <w:rPr>
+      <w:color w:val="4070A0"/>
     </w:rPr>
   </w:style>
   <w:style w:type="character" w:customStyle="1" w:styleId="VerbatimStringTok">
     <w:name w:val="VerbatimStringTok"/>
-    <w:basedOn w:val="VerbatimChar"/>
-    <w:rPr>
-      <w:color w:val="4070a0"/>
+    <w:rPr>
+      <w:color w:val="4070A0"/>
     </w:rPr>
   </w:style>
   <w:style w:type="character" w:customStyle="1" w:styleId="SpecialStringTok">
     <w:name w:val="SpecialStringTok"/>
-    <w:basedOn w:val="VerbatimChar"/>
-    <w:rPr>
-      <w:color w:val="bb6688"/>
+    <w:rPr>
+      <w:color w:val="BB6688"/>
     </w:rPr>
   </w:style>
   <w:style w:type="character" w:customStyle="1" w:styleId="ImportTok">
     <w:name w:val="ImportTok"/>
-    <w:basedOn w:val="VerbatimChar"/>
     <w:rPr>
       <w:b/>
       <w:color w:val="008000"/>
@@ -2273,62 +2233,54 @@
   </w:style>
   <w:style w:type="character" w:customStyle="1" w:styleId="CommentTok">
     <w:name w:val="CommentTok"/>
-    <w:basedOn w:val="VerbatimChar"/>
     <w:rPr>
       <w:i/>
-      <w:color w:val="60a0b0"/>
+      <w:color w:val="60A0B0"/>
     </w:rPr>
   </w:style>
   <w:style w:type="character" w:customStyle="1" w:styleId="DocumentationTok">
     <w:name w:val="DocumentationTok"/>
-    <w:basedOn w:val="VerbatimChar"/>
     <w:rPr>
       <w:i/>
-      <w:color w:val="ba2121"/>
+      <w:color w:val="BA2121"/>
     </w:rPr>
   </w:style>
   <w:style w:type="character" w:customStyle="1" w:styleId="AnnotationTok">
     <w:name w:val="AnnotationTok"/>
-    <w:basedOn w:val="VerbatimChar"/>
     <w:rPr>
       <w:b/>
       <w:i/>
-      <w:color w:val="60a0b0"/>
+      <w:color w:val="60A0B0"/>
     </w:rPr>
   </w:style>
   <w:style w:type="character" w:customStyle="1" w:styleId="CommentVarTok">
     <w:name w:val="CommentVarTok"/>
-    <w:basedOn w:val="VerbatimChar"/>
     <w:rPr>
       <w:b/>
       <w:i/>
-      <w:color w:val="60a0b0"/>
+      <w:color w:val="60A0B0"/>
     </w:rPr>
   </w:style>
   <w:style w:type="character" w:customStyle="1" w:styleId="OtherTok">
     <w:name w:val="OtherTok"/>
-    <w:basedOn w:val="VerbatimChar"/>
     <w:rPr>
       <w:color w:val="007020"/>
     </w:rPr>
   </w:style>
   <w:style w:type="character" w:customStyle="1" w:styleId="FunctionTok">
     <w:name w:val="FunctionTok"/>
-    <w:basedOn w:val="VerbatimChar"/>
-    <w:rPr>
-      <w:color w:val="06287e"/>
+    <w:rPr>
+      <w:color w:val="06287E"/>
     </w:rPr>
   </w:style>
   <w:style w:type="character" w:customStyle="1" w:styleId="VariableTok">
     <w:name w:val="VariableTok"/>
-    <w:basedOn w:val="VerbatimChar"/>
-    <w:rPr>
-      <w:color w:val="19177c"/>
+    <w:rPr>
+      <w:color w:val="19177C"/>
     </w:rPr>
   </w:style>
   <w:style w:type="character" w:customStyle="1" w:styleId="ControlFlowTok">
     <w:name w:val="ControlFlowTok"/>
-    <w:basedOn w:val="VerbatimChar"/>
     <w:rPr>
       <w:b/>
       <w:color w:val="007020"/>
@@ -2336,80 +2288,66 @@
   </w:style>
   <w:style w:type="character" w:customStyle="1" w:styleId="OperatorTok">
     <w:name w:val="OperatorTok"/>
-    <w:basedOn w:val="VerbatimChar"/>
     <w:rPr>
       <w:color w:val="666666"/>
     </w:rPr>
   </w:style>
   <w:style w:type="character" w:customStyle="1" w:styleId="BuiltInTok">
     <w:name w:val="BuiltInTok"/>
-    <w:basedOn w:val="VerbatimChar"/>
     <w:rPr>
       <w:color w:val="008000"/>
     </w:rPr>
   </w:style>
   <w:style w:type="character" w:customStyle="1" w:styleId="ExtensionTok">
     <w:name w:val="ExtensionTok"/>
-    <w:basedOn w:val="VerbatimChar"/>
-    <w:rPr/>
   </w:style>
   <w:style w:type="character" w:customStyle="1" w:styleId="PreprocessorTok">
     <w:name w:val="PreprocessorTok"/>
-    <w:basedOn w:val="VerbatimChar"/>
-    <w:rPr>
-      <w:color w:val="bc7a00"/>
+    <w:rPr>
+      <w:color w:val="BC7A00"/>
     </w:rPr>
   </w:style>
   <w:style w:type="character" w:customStyle="1" w:styleId="AttributeTok">
     <w:name w:val="AttributeTok"/>
-    <w:basedOn w:val="VerbatimChar"/>
-    <w:rPr>
-      <w:color w:val="7d9029"/>
+    <w:rPr>
+      <w:color w:val="7D9029"/>
     </w:rPr>
   </w:style>
   <w:style w:type="character" w:customStyle="1" w:styleId="RegionMarkerTok">
     <w:name w:val="RegionMarkerTok"/>
-    <w:basedOn w:val="VerbatimChar"/>
-    <w:rPr/>
   </w:style>
   <w:style w:type="character" w:customStyle="1" w:styleId="InformationTok">
     <w:name w:val="InformationTok"/>
-    <w:basedOn w:val="VerbatimChar"/>
     <w:rPr>
       <w:b/>
       <w:i/>
-      <w:color w:val="60a0b0"/>
+      <w:color w:val="60A0B0"/>
     </w:rPr>
   </w:style>
   <w:style w:type="character" w:customStyle="1" w:styleId="WarningTok">
     <w:name w:val="WarningTok"/>
-    <w:basedOn w:val="VerbatimChar"/>
     <w:rPr>
       <w:b/>
       <w:i/>
-      <w:color w:val="60a0b0"/>
+      <w:color w:val="60A0B0"/>
     </w:rPr>
   </w:style>
   <w:style w:type="character" w:customStyle="1" w:styleId="AlertTok">
     <w:name w:val="AlertTok"/>
-    <w:basedOn w:val="VerbatimChar"/>
     <w:rPr>
       <w:b/>
-      <w:color w:val="ff0000"/>
+      <w:color w:val="FF0000"/>
     </w:rPr>
   </w:style>
   <w:style w:type="character" w:customStyle="1" w:styleId="ErrorTok">
     <w:name w:val="ErrorTok"/>
-    <w:basedOn w:val="VerbatimChar"/>
     <w:rPr>
       <w:b/>
-      <w:color w:val="ff0000"/>
+      <w:color w:val="FF0000"/>
     </w:rPr>
   </w:style>
   <w:style w:type="character" w:customStyle="1" w:styleId="NormalTok">
     <w:name w:val="NormalTok"/>
-    <w:basedOn w:val="VerbatimChar"/>
-    <w:rPr/>
   </w:style>
 </w:styles>
 </file>

</xml_diff>